<commit_message>
Minor edit to 4 and edits to template
</commit_message>
<xml_diff>
--- a/Front Matter/Template/Pieces/3_Front-Matter.docx
+++ b/Front Matter/Template/Pieces/3_Front-Matter.docx
@@ -4616,6 +4616,32 @@
         </w:rPr>
         <w:t xml:space="preserve"> Chinese Woodblock</w:t>
       </w:r>
+      <w:r>
+        <w:rPr>
+          <w:rFonts w:ascii="Noto Serif SC" w:eastAsia="Noto Serif SC" w:hAnsi="Noto Serif SC" w:cs="Noto Serif"/>
+          <w:sz w:val="20"/>
+          <w:szCs w:val="20"/>
+        </w:rPr>
+        <w:t xml:space="preserve"> (</w:t>
+      </w:r>
+      <w:proofErr w:type="spellStart"/>
+      <w:r>
+        <w:rPr>
+          <w:rFonts w:ascii="Noto Serif SC" w:eastAsia="Noto Serif SC" w:hAnsi="Noto Serif SC" w:cs="Noto Serif"/>
+          <w:sz w:val="20"/>
+          <w:szCs w:val="20"/>
+        </w:rPr>
+        <w:t>Muyu</w:t>
+      </w:r>
+      <w:proofErr w:type="spellEnd"/>
+      <w:r>
+        <w:rPr>
+          <w:rFonts w:ascii="Noto Serif SC" w:eastAsia="Noto Serif SC" w:hAnsi="Noto Serif SC" w:cs="Noto Serif"/>
+          <w:sz w:val="20"/>
+          <w:szCs w:val="20"/>
+        </w:rPr>
+        <w:t>)</w:t>
+      </w:r>
     </w:p>
     <w:p>
       <w:pPr>
@@ -4650,7 +4676,23 @@
           <w:sz w:val="20"/>
           <w:szCs w:val="20"/>
         </w:rPr>
-        <w:t xml:space="preserve"> Chinese Woodblock, </w:t>
+        <w:t xml:space="preserve"> Chinese Woodblock</w:t>
+      </w:r>
+      <w:r>
+        <w:rPr>
+          <w:rFonts w:ascii="Noto Serif SC" w:eastAsia="Noto Serif SC" w:hAnsi="Noto Serif SC" w:cs="Noto Serif"/>
+          <w:sz w:val="20"/>
+          <w:szCs w:val="20"/>
+        </w:rPr>
+        <w:t xml:space="preserve"> (Muyu)</w:t>
+      </w:r>
+      <w:r>
+        <w:rPr>
+          <w:rFonts w:ascii="Noto Serif SC" w:eastAsia="Noto Serif SC" w:hAnsi="Noto Serif SC" w:cs="Noto Serif"/>
+          <w:sz w:val="20"/>
+          <w:szCs w:val="20"/>
+        </w:rPr>
+        <w:t xml:space="preserve">, </w:t>
       </w:r>
       <w:r>
         <w:rPr>
@@ -6913,8 +6955,8 @@
           <w:noProof/>
         </w:rPr>
         <w:pict w14:anchorId="62D7E167">
-          <v:shape id="Picture 7" o:spid="_x0000_i1026" type="#_x0000_t75" alt="A black background with a black square&#13;&#13;&#13;&#13;&#13;&#13;&#13;&#13;&#13;&#13;&#10;&#13;&#13;&#13;&#13;&#13;&#13;&#13;&#13;&#13;&#13;&#10;Description automatically generated with medium confidence" style="width:8pt;height:13.7pt;visibility:visible;mso-wrap-style:square;mso-width-percent:0;mso-height-percent:0;mso-width-percent:0;mso-height-percent:0">
-            <v:imagedata r:id="rId19" o:title="A black background with a black square&#13;&#13;&#13;&#13;&#13;&#13;&#13;&#13;&#13;&#13;&#10;&#13;&#13;&#13;&#13;&#13;&#13;&#13;&#13;&#13;&#13;&#10;Description automatically generated with medium confidence"/>
+          <v:shape id="Picture 7" o:spid="_x0000_i1026" type="#_x0000_t75" alt="A black background with a black square&#13;&#13;&#13;&#13;&#13;&#13;&#13;&#13;&#13;&#13;&#13;&#10;&#13;&#13;&#13;&#13;&#13;&#13;&#13;&#13;&#13;&#13;&#13;&#10;Description automatically generated with medium confidence" style="width:8pt;height:13.7pt;visibility:visible;mso-wrap-style:square;mso-width-percent:0;mso-height-percent:0;mso-width-percent:0;mso-height-percent:0">
+            <v:imagedata r:id="rId19" o:title="A black background with a black square&#13;&#13;&#13;&#13;&#13;&#13;&#13;&#13;&#13;&#13;&#13;&#10;&#13;&#13;&#13;&#13;&#13;&#13;&#13;&#13;&#13;&#13;&#13;&#10;Description automatically generated with medium confidence"/>
           </v:shape>
         </w:pict>
       </w:r>
@@ -9951,7 +9993,7 @@
           <w:noProof/>
         </w:rPr>
         <w:drawing>
-          <wp:anchor distT="0" distB="0" distL="114300" distR="114300" simplePos="0" relativeHeight="251659264" behindDoc="0" locked="0" layoutInCell="1" allowOverlap="1" wp14:anchorId="4C71412A" wp14:editId="1D530D3E">
+          <wp:anchor distT="0" distB="0" distL="114300" distR="114300" simplePos="0" relativeHeight="251659264" behindDoc="0" locked="0" layoutInCell="1" allowOverlap="1" wp14:anchorId="4C71412A" wp14:editId="1751B61A">
             <wp:simplePos x="0" y="0"/>
             <wp:positionH relativeFrom="column">
               <wp:posOffset>965453</wp:posOffset>
@@ -11362,14 +11404,14 @@
         <v:path o:extrusionok="f" gradientshapeok="t" o:connecttype="rect"/>
         <o:lock v:ext="edit" aspectratio="t"/>
       </v:shapetype>
-      <v:shape id="_x0000_i1042" type="#_x0000_t75" alt="A black background with a black square&#13;&#13;&#13;&#13;&#13;&#13;&#13;&#13;&#13;&#13;&#10;&#13;&#13;&#13;&#13;&#13;&#13;&#13;&#13;&#13;&#13;&#10;Description automatically generated with medium confidence" style="width:3in;height:523.45pt;visibility:visible;mso-wrap-style:square" o:bullet="t">
-        <v:imagedata r:id="rId1" o:title="A black background with a black square&#13;&#13;&#13;&#13;&#13;&#13;&#13;&#13;&#13;&#13;&#10;&#13;&#13;&#13;&#13;&#13;&#13;&#13;&#13;&#13;&#13;&#10;Description automatically generated with medium confidence"/>
+      <v:shape id="_x0000_i1060" type="#_x0000_t75" alt="A black background with a black square&#13;&#13;&#13;&#13;&#13;&#13;&#13;&#13;&#13;&#13;&#13;&#10;&#13;&#13;&#13;&#13;&#13;&#13;&#13;&#13;&#13;&#13;&#13;&#10;Description automatically generated with medium confidence" style="width:3in;height:523.45pt;visibility:visible;mso-wrap-style:square" o:bullet="t">
+        <v:imagedata r:id="rId1" o:title="A black background with a black square&#13;&#13;&#13;&#13;&#13;&#13;&#13;&#13;&#13;&#13;&#13;&#10;&#13;&#13;&#13;&#13;&#13;&#13;&#13;&#13;&#13;&#13;&#13;&#10;Description automatically generated with medium confidence"/>
       </v:shape>
     </w:pict>
   </w:numPicBullet>
   <w:numPicBullet w:numPicBulletId="1">
     <w:pict>
-      <v:shape id="_x0000_i1043" type="#_x0000_t75" style="width:276.55pt;height:422.85pt;flip:x;visibility:visible;mso-wrap-style:square" o:bullet="t">
+      <v:shape id="_x0000_i1061" type="#_x0000_t75" style="width:276.55pt;height:422.85pt;flip:x;visibility:visible;mso-wrap-style:square" o:bullet="t">
         <v:imagedata r:id="rId2" o:title=""/>
       </v:shape>
     </w:pict>

</xml_diff>

<commit_message>
Score 3 front matter Chinese text clean up
</commit_message>
<xml_diff>
--- a/Front Matter/Template/Pieces/3_Front-Matter.docx
+++ b/Front Matter/Template/Pieces/3_Front-Matter.docx
@@ -122,25 +122,7 @@
           <w:sz w:val="32"/>
           <w:szCs w:val="56"/>
         </w:rPr>
-        <w:t xml:space="preserve">or </w:t>
-      </w:r>
-      <w:proofErr w:type="spellStart"/>
-      <w:r>
-        <w:rPr>
-          <w:rFonts w:ascii="Noto Serif SC" w:eastAsia="Noto Serif SC" w:hAnsi="Noto Serif SC" w:cs="Noto Serif"/>
-          <w:sz w:val="32"/>
-          <w:szCs w:val="56"/>
-        </w:rPr>
-        <w:t>Zhudi</w:t>
-      </w:r>
-      <w:proofErr w:type="spellEnd"/>
-      <w:r>
-        <w:rPr>
-          <w:rFonts w:ascii="Noto Serif SC" w:eastAsia="Noto Serif SC" w:hAnsi="Noto Serif SC" w:cs="Noto Serif"/>
-          <w:sz w:val="32"/>
-          <w:szCs w:val="56"/>
-        </w:rPr>
-        <w:t>, Pipa and Chinese Orchestra</w:t>
+        <w:t>or Zhudi, Pipa and Chinese Orchestra</w:t>
       </w:r>
     </w:p>
     <w:p>
@@ -191,16 +173,15 @@
           <w:sz w:val="40"/>
           <w:szCs w:val="96"/>
         </w:rPr>
-        <w:t xml:space="preserve">Zhu </w:t>
-      </w:r>
-      <w:proofErr w:type="spellStart"/>
+        <w:t>Zhu Yi</w:t>
+      </w:r>
       <w:r>
         <w:rPr>
           <w:rFonts w:ascii="Noto Serif SC" w:eastAsia="Noto Serif SC" w:hAnsi="Noto Serif SC" w:cs="Noto Serif"/>
           <w:sz w:val="40"/>
           <w:szCs w:val="96"/>
         </w:rPr>
-        <w:t>Yi</w:t>
+        <w:t>q</w:t>
       </w:r>
       <w:r>
         <w:rPr>
@@ -208,17 +189,8 @@
           <w:sz w:val="40"/>
           <w:szCs w:val="96"/>
         </w:rPr>
-        <w:t>q</w:t>
-      </w:r>
-      <w:r>
-        <w:rPr>
-          <w:rFonts w:ascii="Noto Serif SC" w:eastAsia="Noto Serif SC" w:hAnsi="Noto Serif SC" w:cs="Noto Serif"/>
-          <w:sz w:val="40"/>
-          <w:szCs w:val="96"/>
-        </w:rPr>
         <w:t>ing</w:t>
       </w:r>
-      <w:proofErr w:type="spellEnd"/>
     </w:p>
     <w:p>
       <w:pPr>
@@ -834,25 +806,7 @@
           <w:sz w:val="32"/>
           <w:szCs w:val="56"/>
         </w:rPr>
-        <w:t xml:space="preserve">or </w:t>
-      </w:r>
-      <w:proofErr w:type="spellStart"/>
-      <w:r>
-        <w:rPr>
-          <w:rFonts w:ascii="Noto Serif SC" w:eastAsia="Noto Serif SC" w:hAnsi="Noto Serif SC" w:cs="Noto Serif"/>
-          <w:sz w:val="32"/>
-          <w:szCs w:val="56"/>
-        </w:rPr>
-        <w:t>Zhudi</w:t>
-      </w:r>
-      <w:proofErr w:type="spellEnd"/>
-      <w:r>
-        <w:rPr>
-          <w:rFonts w:ascii="Noto Serif SC" w:eastAsia="Noto Serif SC" w:hAnsi="Noto Serif SC" w:cs="Noto Serif"/>
-          <w:sz w:val="32"/>
-          <w:szCs w:val="56"/>
-        </w:rPr>
-        <w:t>, Pipa and Chinese Orchestra</w:t>
+        <w:t>or Zhudi, Pipa and Chinese Orchestra</w:t>
       </w:r>
     </w:p>
     <w:p>
@@ -902,16 +856,15 @@
           <w:sz w:val="40"/>
           <w:szCs w:val="96"/>
         </w:rPr>
-        <w:t xml:space="preserve">Zhu </w:t>
-      </w:r>
-      <w:proofErr w:type="spellStart"/>
+        <w:t>Zhu Yi</w:t>
+      </w:r>
       <w:r>
         <w:rPr>
           <w:rFonts w:ascii="Noto Serif SC" w:eastAsia="Noto Serif SC" w:hAnsi="Noto Serif SC" w:cs="Noto Serif"/>
           <w:sz w:val="40"/>
           <w:szCs w:val="96"/>
         </w:rPr>
-        <w:t>Yi</w:t>
+        <w:t>q</w:t>
       </w:r>
       <w:r>
         <w:rPr>
@@ -919,17 +872,8 @@
           <w:sz w:val="40"/>
           <w:szCs w:val="96"/>
         </w:rPr>
-        <w:t>q</w:t>
-      </w:r>
-      <w:r>
-        <w:rPr>
-          <w:rFonts w:ascii="Noto Serif SC" w:eastAsia="Noto Serif SC" w:hAnsi="Noto Serif SC" w:cs="Noto Serif"/>
-          <w:sz w:val="40"/>
-          <w:szCs w:val="96"/>
-        </w:rPr>
         <w:t>ing</w:t>
       </w:r>
-      <w:proofErr w:type="spellEnd"/>
     </w:p>
     <w:p>
       <w:pPr>
@@ -3348,7 +3292,35 @@
           <w:szCs w:val="24"/>
           <w:lang w:val="en-US"/>
         </w:rPr>
-        <w:t>was declining by the start of the 10th century AD. As it declined, so did Borobudur; its importance to the people waned. In 1006 AD Mount Merapi erupted, burying the holy temple of monasticism and worship under a thick layer of volcanic ash for centuries to come, leaving the place to sit in perpetual silence.</w:t>
+        <w:t>was declining by the start of the 10</w:t>
+      </w:r>
+      <w:r>
+        <w:rPr>
+          <w:rFonts w:ascii="Noto Serif SC" w:eastAsia="Noto Serif SC" w:hAnsi="Noto Serif SC" w:cs="Noto Serif"/>
+          <w:sz w:val="24"/>
+          <w:szCs w:val="24"/>
+          <w:vertAlign w:val="superscript"/>
+          <w:lang w:val="en-US"/>
+        </w:rPr>
+        <w:t>th</w:t>
+      </w:r>
+      <w:r>
+        <w:rPr>
+          <w:rFonts w:ascii="Noto Serif SC" w:eastAsia="Noto Serif SC" w:hAnsi="Noto Serif SC" w:cs="Noto Serif"/>
+          <w:sz w:val="24"/>
+          <w:szCs w:val="24"/>
+          <w:lang w:val="en-US"/>
+        </w:rPr>
+        <w:t xml:space="preserve"> </w:t>
+      </w:r>
+      <w:r>
+        <w:rPr>
+          <w:rFonts w:ascii="Noto Serif SC" w:eastAsia="Noto Serif SC" w:hAnsi="Noto Serif SC" w:cs="Noto Serif"/>
+          <w:sz w:val="24"/>
+          <w:szCs w:val="24"/>
+          <w:lang w:val="en-US"/>
+        </w:rPr>
+        <w:t>century AD. As it declined, so did Borobudur; its importance to the people waned. In 1006 AD Mount Merapi erupted, burying the holy temple of monasticism and worship under a thick layer of volcanic ash for centuries to come, leaving the place to sit in perpetual silence.</w:t>
       </w:r>
     </w:p>
     <w:p>
@@ -4622,7 +4594,123 @@
           <w:sz w:val="20"/>
           <w:szCs w:val="20"/>
         </w:rPr>
-        <w:t xml:space="preserve"> (</w:t>
+        <w:t xml:space="preserve"> (Muyu)</w:t>
+      </w:r>
+    </w:p>
+    <w:p>
+      <w:pPr>
+        <w:ind w:left="288"/>
+        <w:rPr>
+          <w:rFonts w:ascii="Noto Serif SC" w:eastAsia="Noto Serif SC" w:hAnsi="Noto Serif SC" w:cs="Noto Serif"/>
+          <w:sz w:val="20"/>
+          <w:szCs w:val="20"/>
+          <w:lang w:val="en-US"/>
+        </w:rPr>
+      </w:pPr>
+      <w:r>
+        <w:rPr>
+          <w:rFonts w:ascii="Noto Serif SC" w:eastAsia="Noto Serif SC" w:hAnsi="Noto Serif SC" w:cs="Noto Serif"/>
+          <w:sz w:val="20"/>
+          <w:szCs w:val="20"/>
+          <w:lang w:val="en-US"/>
+        </w:rPr>
+        <w:t xml:space="preserve">II: </w:t>
+      </w:r>
+      <w:r>
+        <w:rPr>
+          <w:rFonts w:ascii="Noto Serif SC" w:eastAsia="Noto Serif SC" w:hAnsi="Noto Serif SC" w:cs="Noto Serif" w:hint="eastAsia"/>
+          <w:sz w:val="20"/>
+          <w:szCs w:val="20"/>
+        </w:rPr>
+        <w:t>中国木鱼</w:t>
+      </w:r>
+      <w:r>
+        <w:rPr>
+          <w:rFonts w:ascii="Noto Serif SC" w:eastAsia="Noto Serif SC" w:hAnsi="Noto Serif SC" w:cs="Noto Serif"/>
+          <w:sz w:val="20"/>
+          <w:szCs w:val="20"/>
+        </w:rPr>
+        <w:t xml:space="preserve"> Chinese Woodblock</w:t>
+      </w:r>
+      <w:r>
+        <w:rPr>
+          <w:rFonts w:ascii="Noto Serif SC" w:eastAsia="Noto Serif SC" w:hAnsi="Noto Serif SC" w:cs="Noto Serif"/>
+          <w:sz w:val="20"/>
+          <w:szCs w:val="20"/>
+        </w:rPr>
+        <w:t xml:space="preserve"> (Muyu)</w:t>
+      </w:r>
+      <w:r>
+        <w:rPr>
+          <w:rFonts w:ascii="Noto Serif SC" w:eastAsia="Noto Serif SC" w:hAnsi="Noto Serif SC" w:cs="Noto Serif"/>
+          <w:sz w:val="20"/>
+          <w:szCs w:val="20"/>
+        </w:rPr>
+        <w:t xml:space="preserve">, </w:t>
+      </w:r>
+      <w:r>
+        <w:rPr>
+          <w:rFonts w:ascii="Noto Serif SC" w:eastAsia="Noto Serif SC" w:hAnsi="Noto Serif SC" w:cs="Noto Serif" w:hint="eastAsia"/>
+          <w:sz w:val="20"/>
+          <w:szCs w:val="20"/>
+        </w:rPr>
+        <w:t>颤音琴</w:t>
+      </w:r>
+      <w:r>
+        <w:rPr>
+          <w:rFonts w:ascii="Noto Serif SC" w:eastAsia="Noto Serif SC" w:hAnsi="Noto Serif SC" w:cs="Noto Serif"/>
+          <w:sz w:val="20"/>
+          <w:szCs w:val="20"/>
+        </w:rPr>
+        <w:t xml:space="preserve"> Vibraphone, </w:t>
+      </w:r>
+      <w:r>
+        <w:rPr>
+          <w:rFonts w:ascii="Noto Serif SC" w:eastAsia="Noto Serif SC" w:hAnsi="Noto Serif SC" w:cs="Noto Serif" w:hint="eastAsia"/>
+          <w:sz w:val="20"/>
+          <w:szCs w:val="20"/>
+        </w:rPr>
+        <w:t>大钹</w:t>
+      </w:r>
+      <w:r>
+        <w:rPr>
+          <w:rFonts w:ascii="Noto Serif SC" w:eastAsia="Noto Serif SC" w:hAnsi="Noto Serif SC" w:cs="Noto Serif"/>
+          <w:sz w:val="20"/>
+          <w:szCs w:val="20"/>
+        </w:rPr>
+        <w:t xml:space="preserve"> Dabo</w:t>
+      </w:r>
+      <w:r>
+        <w:rPr>
+          <w:rFonts w:ascii="Noto Serif SC" w:eastAsia="Noto Serif SC" w:hAnsi="Noto Serif SC" w:cs="Noto Serif"/>
+          <w:sz w:val="20"/>
+          <w:szCs w:val="20"/>
+        </w:rPr>
+        <w:t>,</w:t>
+      </w:r>
+      <w:r>
+        <w:rPr>
+          <w:rFonts w:ascii="Noto Serif SC" w:eastAsia="Noto Serif SC" w:hAnsi="Noto Serif SC" w:cs="Noto Serif"/>
+          <w:sz w:val="20"/>
+          <w:szCs w:val="20"/>
+        </w:rPr>
+        <w:t xml:space="preserve"> </w:t>
+      </w:r>
+      <w:r>
+        <w:rPr>
+          <w:rFonts w:ascii="Noto Serif SC" w:eastAsia="Noto Serif SC" w:hAnsi="Noto Serif SC" w:cs="Noto Serif" w:hint="eastAsia"/>
+          <w:sz w:val="20"/>
+          <w:szCs w:val="20"/>
+        </w:rPr>
+        <w:t>排鼓</w:t>
+      </w:r>
+      <w:r>
+        <w:rPr>
+          <w:rFonts w:ascii="Noto Serif SC" w:eastAsia="Noto Serif SC" w:hAnsi="Noto Serif SC" w:cs="Noto Serif"/>
+          <w:sz w:val="20"/>
+          <w:szCs w:val="20"/>
+        </w:rPr>
+        <w:t xml:space="preserve"> </w:t>
       </w:r>
       <w:proofErr w:type="spellStart"/>
       <w:r>
@@ -4631,7 +4719,7 @@
           <w:sz w:val="20"/>
           <w:szCs w:val="20"/>
         </w:rPr>
-        <w:t>Muyu</w:t>
+        <w:t>Paigu</w:t>
       </w:r>
       <w:proofErr w:type="spellEnd"/>
       <w:r>
@@ -4640,52 +4728,526 @@
           <w:sz w:val="20"/>
           <w:szCs w:val="20"/>
         </w:rPr>
+        <w:t xml:space="preserve">, </w:t>
+      </w:r>
+      <w:r>
+        <w:rPr>
+          <w:rFonts w:ascii="Noto Serif SC" w:eastAsia="Noto Serif SC" w:hAnsi="Noto Serif SC" w:cs="Noto Serif" w:hint="eastAsia"/>
+          <w:sz w:val="20"/>
+          <w:szCs w:val="20"/>
+        </w:rPr>
+        <w:t>军镲</w:t>
+      </w:r>
+      <w:r>
+        <w:rPr>
+          <w:rFonts w:ascii="Noto Serif SC" w:eastAsia="Noto Serif SC" w:hAnsi="Noto Serif SC" w:cs="Noto Serif"/>
+          <w:sz w:val="20"/>
+          <w:szCs w:val="20"/>
+        </w:rPr>
+        <w:t xml:space="preserve"> Cymbals</w:t>
+      </w:r>
+      <w:r>
+        <w:rPr>
+          <w:rFonts w:ascii="Noto Serif SC" w:eastAsia="Noto Serif SC" w:hAnsi="Noto Serif SC" w:cs="Noto Serif"/>
+          <w:sz w:val="20"/>
+          <w:szCs w:val="20"/>
+        </w:rPr>
+        <w:t>,</w:t>
+      </w:r>
+      <w:r>
+        <w:rPr>
+          <w:rFonts w:ascii="Noto Serif SC" w:eastAsia="Noto Serif SC" w:hAnsi="Noto Serif SC" w:cs="Noto Serif"/>
+          <w:sz w:val="20"/>
+          <w:szCs w:val="20"/>
+        </w:rPr>
+        <w:t xml:space="preserve"> </w:t>
+      </w:r>
+      <w:r>
+        <w:rPr>
+          <w:rFonts w:ascii="Noto Serif SC" w:eastAsia="Noto Serif SC" w:hAnsi="Noto Serif SC" w:cs="Noto Serif" w:hint="eastAsia"/>
+          <w:sz w:val="20"/>
+          <w:szCs w:val="20"/>
+        </w:rPr>
+        <w:t>通通鼓</w:t>
+      </w:r>
+      <w:r>
+        <w:rPr>
+          <w:rFonts w:ascii="Noto Serif SC" w:eastAsia="Noto Serif SC" w:hAnsi="Noto Serif SC" w:cs="Noto Serif"/>
+          <w:sz w:val="20"/>
+          <w:szCs w:val="20"/>
+        </w:rPr>
+        <w:t xml:space="preserve"> Tom-toms</w:t>
+      </w:r>
+    </w:p>
+    <w:p>
+      <w:pPr>
+        <w:ind w:left="288"/>
+        <w:rPr>
+          <w:rFonts w:ascii="Noto Serif SC" w:eastAsia="Noto Serif SC" w:hAnsi="Noto Serif SC" w:cs="Noto Serif"/>
+          <w:sz w:val="20"/>
+          <w:szCs w:val="20"/>
+        </w:rPr>
+      </w:pPr>
+      <w:r>
+        <w:rPr>
+          <w:rFonts w:ascii="Noto Serif SC" w:eastAsia="Noto Serif SC" w:hAnsi="Noto Serif SC" w:cs="Noto Serif"/>
+          <w:sz w:val="20"/>
+          <w:szCs w:val="20"/>
+          <w:lang w:val="en-US"/>
+        </w:rPr>
+        <w:t xml:space="preserve">III: </w:t>
+      </w:r>
+      <w:r>
+        <w:rPr>
+          <w:rFonts w:ascii="Noto Serif SC" w:eastAsia="Noto Serif SC" w:hAnsi="Noto Serif SC" w:cs="Noto Serif" w:hint="eastAsia"/>
+          <w:sz w:val="20"/>
+          <w:szCs w:val="20"/>
+        </w:rPr>
+        <w:t>木琴</w:t>
+      </w:r>
+      <w:r>
+        <w:rPr>
+          <w:rFonts w:ascii="Noto Serif SC" w:eastAsia="Noto Serif SC" w:hAnsi="Noto Serif SC" w:cs="Noto Serif"/>
+          <w:sz w:val="20"/>
+          <w:szCs w:val="20"/>
+        </w:rPr>
+        <w:t xml:space="preserve"> Xylophone, </w:t>
+      </w:r>
+      <w:r>
+        <w:rPr>
+          <w:rFonts w:ascii="Noto Serif SC" w:eastAsia="Noto Serif SC" w:hAnsi="Noto Serif SC" w:cs="Noto Serif" w:hint="eastAsia"/>
+          <w:sz w:val="20"/>
+          <w:szCs w:val="20"/>
+        </w:rPr>
+        <w:t>通通鼓</w:t>
+      </w:r>
+      <w:r>
+        <w:rPr>
+          <w:rFonts w:ascii="Noto Serif SC" w:eastAsia="Noto Serif SC" w:hAnsi="Noto Serif SC" w:cs="Noto Serif"/>
+          <w:sz w:val="20"/>
+          <w:szCs w:val="20"/>
+        </w:rPr>
+        <w:t xml:space="preserve"> Tom-toms, </w:t>
+      </w:r>
+      <w:r>
+        <w:rPr>
+          <w:rFonts w:ascii="Noto Serif SC" w:eastAsia="Noto Serif SC" w:hAnsi="Noto Serif SC" w:cs="Noto Serif" w:hint="eastAsia"/>
+          <w:sz w:val="20"/>
+          <w:szCs w:val="20"/>
+        </w:rPr>
+        <w:t>乐鞭</w:t>
+      </w:r>
+      <w:r>
+        <w:rPr>
+          <w:rFonts w:ascii="Noto Serif SC" w:eastAsia="Noto Serif SC" w:hAnsi="Noto Serif SC" w:cs="Noto Serif"/>
+          <w:sz w:val="20"/>
+          <w:szCs w:val="20"/>
+        </w:rPr>
+        <w:t xml:space="preserve"> Whip, </w:t>
+      </w:r>
+      <w:r>
+        <w:rPr>
+          <w:rFonts w:ascii="Noto Serif SC" w:eastAsia="Noto Serif SC" w:hAnsi="Noto Serif SC" w:cs="Noto Serif" w:hint="eastAsia"/>
+          <w:sz w:val="20"/>
+          <w:szCs w:val="20"/>
+        </w:rPr>
+        <w:t>康嘎鼓</w:t>
+      </w:r>
+      <w:r>
+        <w:rPr>
+          <w:rFonts w:ascii="Noto Serif SC" w:eastAsia="Noto Serif SC" w:hAnsi="Noto Serif SC" w:cs="Noto Serif"/>
+          <w:sz w:val="20"/>
+          <w:szCs w:val="20"/>
+        </w:rPr>
+        <w:t xml:space="preserve"> Congas</w:t>
+      </w:r>
+    </w:p>
+    <w:p>
+      <w:pPr>
+        <w:ind w:left="288"/>
+        <w:rPr>
+          <w:rFonts w:ascii="Noto Serif SC" w:eastAsia="Noto Serif SC" w:hAnsi="Noto Serif SC" w:cs="Noto Serif"/>
+          <w:sz w:val="20"/>
+          <w:szCs w:val="20"/>
+        </w:rPr>
+      </w:pPr>
+      <w:r>
+        <w:rPr>
+          <w:rFonts w:ascii="Noto Serif SC" w:eastAsia="Noto Serif SC" w:hAnsi="Noto Serif SC" w:cs="Noto Serif"/>
+          <w:sz w:val="20"/>
+          <w:szCs w:val="20"/>
+          <w:lang w:val="en-US"/>
+        </w:rPr>
+        <w:t xml:space="preserve">IV: </w:t>
+      </w:r>
+      <w:r>
+        <w:rPr>
+          <w:rFonts w:ascii="Noto Serif SC" w:eastAsia="Noto Serif SC" w:hAnsi="Noto Serif SC" w:cs="Noto Serif" w:hint="eastAsia"/>
+          <w:sz w:val="20"/>
+          <w:szCs w:val="20"/>
+        </w:rPr>
+        <w:t>编钟</w:t>
+      </w:r>
+      <w:r>
+        <w:rPr>
+          <w:rFonts w:ascii="Noto Serif SC" w:eastAsia="Noto Serif SC" w:hAnsi="Noto Serif SC" w:cs="Noto Serif"/>
+          <w:sz w:val="20"/>
+          <w:szCs w:val="20"/>
+        </w:rPr>
+        <w:t xml:space="preserve"> </w:t>
+      </w:r>
+      <w:proofErr w:type="spellStart"/>
+      <w:r>
+        <w:rPr>
+          <w:rFonts w:ascii="Noto Serif SC" w:eastAsia="Noto Serif SC" w:hAnsi="Noto Serif SC" w:cs="Noto Serif"/>
+          <w:sz w:val="20"/>
+          <w:szCs w:val="20"/>
+        </w:rPr>
+        <w:t>Bianzhong</w:t>
+      </w:r>
+      <w:proofErr w:type="spellEnd"/>
+      <w:r>
+        <w:rPr>
+          <w:rFonts w:ascii="Noto Serif SC" w:eastAsia="Noto Serif SC" w:hAnsi="Noto Serif SC" w:cs="Noto Serif"/>
+          <w:sz w:val="20"/>
+          <w:szCs w:val="20"/>
+        </w:rPr>
+        <w:t xml:space="preserve">, </w:t>
+      </w:r>
+      <w:r>
+        <w:rPr>
+          <w:rFonts w:ascii="Noto Serif SC" w:eastAsia="Noto Serif SC" w:hAnsi="Noto Serif SC" w:cs="Noto Serif" w:hint="eastAsia"/>
+          <w:sz w:val="20"/>
+          <w:szCs w:val="20"/>
+        </w:rPr>
+        <w:t>通通鼓</w:t>
+      </w:r>
+      <w:r>
+        <w:rPr>
+          <w:rFonts w:ascii="Noto Serif SC" w:eastAsia="Noto Serif SC" w:hAnsi="Noto Serif SC" w:cs="Noto Serif"/>
+          <w:sz w:val="20"/>
+          <w:szCs w:val="20"/>
+        </w:rPr>
+        <w:t xml:space="preserve"> Tom-toms, </w:t>
+      </w:r>
+      <w:r>
+        <w:rPr>
+          <w:rFonts w:ascii="Noto Serif SC" w:eastAsia="Noto Serif SC" w:hAnsi="Noto Serif SC" w:cs="Noto Serif" w:hint="eastAsia"/>
+          <w:sz w:val="20"/>
+          <w:szCs w:val="20"/>
+        </w:rPr>
+        <w:t>马林巴</w:t>
+      </w:r>
+      <w:r>
+        <w:rPr>
+          <w:rFonts w:ascii="Noto Serif SC" w:eastAsia="Noto Serif SC" w:hAnsi="Noto Serif SC" w:cs="Noto Serif"/>
+          <w:sz w:val="20"/>
+          <w:szCs w:val="20"/>
+        </w:rPr>
+        <w:t xml:space="preserve"> Marimba, </w:t>
+      </w:r>
+      <w:r>
+        <w:rPr>
+          <w:rFonts w:ascii="Noto Serif SC" w:eastAsia="Noto Serif SC" w:hAnsi="Noto Serif SC" w:cs="Noto Serif" w:hint="eastAsia"/>
+          <w:sz w:val="20"/>
+          <w:szCs w:val="20"/>
+        </w:rPr>
+        <w:t>军镲</w:t>
+      </w:r>
+      <w:r>
+        <w:rPr>
+          <w:rFonts w:ascii="Noto Serif SC" w:eastAsia="Noto Serif SC" w:hAnsi="Noto Serif SC" w:cs="Noto Serif"/>
+          <w:sz w:val="20"/>
+          <w:szCs w:val="20"/>
+        </w:rPr>
+        <w:t xml:space="preserve"> </w:t>
+      </w:r>
+      <w:r>
+        <w:rPr>
+          <w:rFonts w:ascii="Noto Serif SC" w:eastAsia="Noto Serif SC" w:hAnsi="Noto Serif SC" w:cs="Noto Serif"/>
+          <w:sz w:val="20"/>
+          <w:szCs w:val="20"/>
+        </w:rPr>
+        <w:t>C</w:t>
+      </w:r>
+      <w:r>
+        <w:rPr>
+          <w:rFonts w:ascii="Noto Serif SC" w:eastAsia="Noto Serif SC" w:hAnsi="Noto Serif SC" w:cs="Noto Serif"/>
+          <w:sz w:val="20"/>
+          <w:szCs w:val="20"/>
+        </w:rPr>
+        <w:t>ymbals</w:t>
+      </w:r>
+    </w:p>
+    <w:p>
+      <w:pPr>
+        <w:ind w:left="288"/>
+        <w:rPr>
+          <w:rFonts w:ascii="Noto Serif SC" w:eastAsia="Noto Serif SC" w:hAnsi="Noto Serif SC" w:cs="Noto Serif"/>
+          <w:sz w:val="20"/>
+          <w:szCs w:val="20"/>
+        </w:rPr>
+      </w:pPr>
+      <w:r>
+        <w:rPr>
+          <w:rFonts w:ascii="Noto Serif SC" w:eastAsia="Noto Serif SC" w:hAnsi="Noto Serif SC" w:cs="Noto Serif"/>
+          <w:sz w:val="20"/>
+          <w:szCs w:val="20"/>
+          <w:lang w:val="en-US"/>
+        </w:rPr>
+        <w:t xml:space="preserve">V: </w:t>
+      </w:r>
+      <w:r>
+        <w:rPr>
+          <w:rFonts w:ascii="Noto Serif SC" w:eastAsia="Noto Serif SC" w:hAnsi="Noto Serif SC" w:cs="Noto Serif" w:hint="eastAsia"/>
+          <w:sz w:val="20"/>
+          <w:szCs w:val="20"/>
+        </w:rPr>
+        <w:t>铓锣</w:t>
+      </w:r>
+      <w:r>
+        <w:rPr>
+          <w:rFonts w:ascii="Noto Serif SC" w:eastAsia="Noto Serif SC" w:hAnsi="Noto Serif SC" w:cs="Noto Serif"/>
+          <w:sz w:val="20"/>
+          <w:szCs w:val="20"/>
+        </w:rPr>
+        <w:t xml:space="preserve"> </w:t>
+      </w:r>
+      <w:proofErr w:type="spellStart"/>
+      <w:r>
+        <w:rPr>
+          <w:rFonts w:ascii="Noto Serif SC" w:eastAsia="Noto Serif SC" w:hAnsi="Noto Serif SC" w:cs="Noto Serif"/>
+          <w:sz w:val="20"/>
+          <w:szCs w:val="20"/>
+        </w:rPr>
+        <w:t>Mangluo</w:t>
+      </w:r>
+      <w:proofErr w:type="spellEnd"/>
+      <w:r>
+        <w:rPr>
+          <w:rFonts w:ascii="Noto Serif SC" w:eastAsia="Noto Serif SC" w:hAnsi="Noto Serif SC" w:cs="Noto Serif"/>
+          <w:sz w:val="20"/>
+          <w:szCs w:val="20"/>
+        </w:rPr>
+        <w:t xml:space="preserve">, </w:t>
+      </w:r>
+      <w:r>
+        <w:rPr>
+          <w:rFonts w:ascii="Noto Serif SC" w:eastAsia="Noto Serif SC" w:hAnsi="Noto Serif SC" w:cs="Noto Serif" w:hint="eastAsia"/>
+          <w:sz w:val="20"/>
+          <w:szCs w:val="20"/>
+        </w:rPr>
+        <w:t>颤音琴</w:t>
+      </w:r>
+      <w:r>
+        <w:rPr>
+          <w:rFonts w:ascii="Noto Serif SC" w:eastAsia="Noto Serif SC" w:hAnsi="Noto Serif SC" w:cs="Noto Serif"/>
+          <w:sz w:val="20"/>
+          <w:szCs w:val="20"/>
+        </w:rPr>
+        <w:t xml:space="preserve"> Vibraphone</w:t>
+      </w:r>
+      <w:r>
+        <w:rPr>
+          <w:rFonts w:ascii="Noto Serif SC" w:eastAsia="Noto Serif SC" w:hAnsi="Noto Serif SC" w:cs="Noto Serif"/>
+          <w:sz w:val="20"/>
+          <w:szCs w:val="20"/>
+        </w:rPr>
+        <w:t>,</w:t>
+      </w:r>
+      <w:r>
+        <w:rPr>
+          <w:rFonts w:ascii="Noto Serif SC" w:eastAsia="Noto Serif SC" w:hAnsi="Noto Serif SC" w:cs="Noto Serif"/>
+          <w:sz w:val="20"/>
+          <w:szCs w:val="20"/>
+        </w:rPr>
+        <w:t xml:space="preserve"> </w:t>
+      </w:r>
+      <w:r>
+        <w:rPr>
+          <w:rFonts w:ascii="Noto Serif SC" w:eastAsia="Noto Serif SC" w:hAnsi="Noto Serif SC" w:cs="Noto Serif" w:hint="eastAsia"/>
+          <w:sz w:val="20"/>
+          <w:szCs w:val="20"/>
+        </w:rPr>
+        <w:t>编钟</w:t>
+      </w:r>
+      <w:r>
+        <w:rPr>
+          <w:rFonts w:ascii="Noto Serif SC" w:eastAsia="Noto Serif SC" w:hAnsi="Noto Serif SC" w:cs="Noto Serif"/>
+          <w:sz w:val="20"/>
+          <w:szCs w:val="20"/>
+        </w:rPr>
+        <w:t xml:space="preserve"> </w:t>
+      </w:r>
+      <w:proofErr w:type="spellStart"/>
+      <w:r>
+        <w:rPr>
+          <w:rFonts w:ascii="Noto Serif SC" w:eastAsia="Noto Serif SC" w:hAnsi="Noto Serif SC" w:cs="Noto Serif"/>
+          <w:sz w:val="20"/>
+          <w:szCs w:val="20"/>
+        </w:rPr>
+        <w:t>Bianzhong</w:t>
+      </w:r>
+      <w:proofErr w:type="spellEnd"/>
+      <w:r>
+        <w:rPr>
+          <w:rFonts w:ascii="Noto Serif SC" w:eastAsia="Noto Serif SC" w:hAnsi="Noto Serif SC" w:cs="Noto Serif"/>
+          <w:sz w:val="20"/>
+          <w:szCs w:val="20"/>
+        </w:rPr>
+        <w:t xml:space="preserve">, </w:t>
+      </w:r>
+      <w:r>
+        <w:rPr>
+          <w:rFonts w:ascii="Noto Serif SC" w:eastAsia="Noto Serif SC" w:hAnsi="Noto Serif SC" w:cs="Noto Serif" w:hint="eastAsia"/>
+          <w:sz w:val="20"/>
+          <w:szCs w:val="20"/>
+        </w:rPr>
+        <w:t>大军鼓</w:t>
+      </w:r>
+      <w:r>
+        <w:rPr>
+          <w:rFonts w:ascii="Noto Serif SC" w:eastAsia="Noto Serif SC" w:hAnsi="Noto Serif SC" w:cs="Noto Serif"/>
+          <w:sz w:val="20"/>
+          <w:szCs w:val="20"/>
+        </w:rPr>
+        <w:t xml:space="preserve"> Bass </w:t>
+      </w:r>
+      <w:r>
+        <w:rPr>
+          <w:rFonts w:ascii="Noto Serif SC" w:eastAsia="Noto Serif SC" w:hAnsi="Noto Serif SC" w:cs="Noto Serif"/>
+          <w:sz w:val="20"/>
+          <w:szCs w:val="20"/>
+        </w:rPr>
+        <w:t>D</w:t>
+      </w:r>
+      <w:r>
+        <w:rPr>
+          <w:rFonts w:ascii="Noto Serif SC" w:eastAsia="Noto Serif SC" w:hAnsi="Noto Serif SC" w:cs="Noto Serif"/>
+          <w:sz w:val="20"/>
+          <w:szCs w:val="20"/>
+        </w:rPr>
+        <w:t xml:space="preserve">rum, </w:t>
+      </w:r>
+      <w:r>
+        <w:rPr>
+          <w:rFonts w:ascii="Noto Serif SC" w:eastAsia="Noto Serif SC" w:hAnsi="Noto Serif SC" w:cs="Noto Serif" w:hint="eastAsia"/>
+          <w:sz w:val="20"/>
+          <w:szCs w:val="20"/>
+        </w:rPr>
+        <w:t>大锣</w:t>
+      </w:r>
+      <w:r>
+        <w:rPr>
+          <w:rFonts w:ascii="Noto Serif SC" w:eastAsia="Noto Serif SC" w:hAnsi="Noto Serif SC" w:cs="Noto Serif"/>
+          <w:sz w:val="20"/>
+          <w:szCs w:val="20"/>
+        </w:rPr>
+        <w:t xml:space="preserve"> </w:t>
+      </w:r>
+      <w:proofErr w:type="spellStart"/>
+      <w:r>
+        <w:rPr>
+          <w:rFonts w:ascii="Noto Serif SC" w:eastAsia="Noto Serif SC" w:hAnsi="Noto Serif SC" w:cs="Noto Serif"/>
+          <w:sz w:val="20"/>
+          <w:szCs w:val="20"/>
+        </w:rPr>
+        <w:t>Daluo</w:t>
+      </w:r>
+      <w:proofErr w:type="spellEnd"/>
+    </w:p>
+    <w:p>
+      <w:pPr>
+        <w:ind w:left="288"/>
+        <w:rPr>
+          <w:rFonts w:ascii="Noto Serif SC" w:eastAsia="Noto Serif SC" w:hAnsi="Noto Serif SC" w:cs="Noto Serif"/>
+          <w:sz w:val="20"/>
+          <w:szCs w:val="20"/>
+          <w:lang w:val="en-US"/>
+        </w:rPr>
+      </w:pPr>
+      <w:r>
+        <w:rPr>
+          <w:rFonts w:ascii="Noto Serif SC" w:eastAsia="Noto Serif SC" w:hAnsi="Noto Serif SC" w:cs="Noto Serif"/>
+          <w:sz w:val="20"/>
+          <w:szCs w:val="20"/>
+        </w:rPr>
+        <w:t xml:space="preserve">VI: </w:t>
+      </w:r>
+      <w:r>
+        <w:rPr>
+          <w:rFonts w:ascii="Noto Serif SC" w:eastAsia="Noto Serif SC" w:hAnsi="Noto Serif SC" w:cs="Noto Serif"/>
+          <w:sz w:val="20"/>
+          <w:szCs w:val="20"/>
+        </w:rPr>
+        <w:t>(</w:t>
+      </w:r>
+      <w:r>
+        <w:rPr>
+          <w:rFonts w:ascii="Noto Serif SC" w:eastAsia="Noto Serif SC" w:hAnsi="Noto Serif SC" w:cs="Noto Serif" w:hint="eastAsia"/>
+          <w:sz w:val="20"/>
+          <w:szCs w:val="20"/>
+        </w:rPr>
+        <w:t>中国</w:t>
+      </w:r>
+      <w:r>
+        <w:rPr>
+          <w:rFonts w:ascii="Noto Serif SC" w:eastAsia="Noto Serif SC" w:hAnsi="Noto Serif SC" w:cs="Noto Serif"/>
+          <w:sz w:val="20"/>
+          <w:szCs w:val="20"/>
+        </w:rPr>
         <w:t>)</w:t>
       </w:r>
-    </w:p>
-    <w:p>
-      <w:pPr>
-        <w:ind w:left="288"/>
-        <w:rPr>
-          <w:rFonts w:ascii="Noto Serif SC" w:eastAsia="Noto Serif SC" w:hAnsi="Noto Serif SC" w:cs="Noto Serif"/>
-          <w:sz w:val="20"/>
-          <w:szCs w:val="20"/>
-          <w:lang w:val="en-US"/>
-        </w:rPr>
-      </w:pPr>
-      <w:r>
-        <w:rPr>
-          <w:rFonts w:ascii="Noto Serif SC" w:eastAsia="Noto Serif SC" w:hAnsi="Noto Serif SC" w:cs="Noto Serif"/>
-          <w:sz w:val="20"/>
-          <w:szCs w:val="20"/>
-          <w:lang w:val="en-US"/>
-        </w:rPr>
-        <w:t xml:space="preserve">II: </w:t>
-      </w:r>
-      <w:r>
-        <w:rPr>
-          <w:rFonts w:ascii="Noto Serif SC" w:eastAsia="Noto Serif SC" w:hAnsi="Noto Serif SC" w:cs="Noto Serif" w:hint="eastAsia"/>
-          <w:sz w:val="20"/>
-          <w:szCs w:val="20"/>
-        </w:rPr>
-        <w:t>中国木鱼</w:t>
-      </w:r>
-      <w:r>
-        <w:rPr>
-          <w:rFonts w:ascii="Noto Serif SC" w:eastAsia="Noto Serif SC" w:hAnsi="Noto Serif SC" w:cs="Noto Serif"/>
-          <w:sz w:val="20"/>
-          <w:szCs w:val="20"/>
-        </w:rPr>
-        <w:t xml:space="preserve"> Chinese Woodblock</w:t>
-      </w:r>
-      <w:r>
-        <w:rPr>
-          <w:rFonts w:ascii="Noto Serif SC" w:eastAsia="Noto Serif SC" w:hAnsi="Noto Serif SC" w:cs="Noto Serif"/>
-          <w:sz w:val="20"/>
-          <w:szCs w:val="20"/>
-        </w:rPr>
-        <w:t xml:space="preserve"> (Muyu)</w:t>
-      </w:r>
+      <w:r>
+        <w:rPr>
+          <w:rFonts w:ascii="Noto Serif SC" w:eastAsia="Noto Serif SC" w:hAnsi="Noto Serif SC" w:cs="Noto Serif" w:hint="eastAsia"/>
+          <w:sz w:val="20"/>
+          <w:szCs w:val="20"/>
+        </w:rPr>
+        <w:t>大鼓</w:t>
+      </w:r>
+      <w:r>
+        <w:rPr>
+          <w:rFonts w:ascii="Noto Serif SC" w:eastAsia="Noto Serif SC" w:hAnsi="Noto Serif SC" w:cs="Noto Serif"/>
+          <w:sz w:val="20"/>
+          <w:szCs w:val="20"/>
+        </w:rPr>
+        <w:t xml:space="preserve"> Dagu,</w:t>
+      </w:r>
+      <w:r>
+        <w:rPr>
+          <w:rFonts w:ascii="Noto Serif SC" w:eastAsia="Noto Serif SC" w:hAnsi="Noto Serif SC" w:cs="Noto Serif"/>
+          <w:sz w:val="20"/>
+          <w:szCs w:val="20"/>
+        </w:rPr>
+        <w:t xml:space="preserve"> </w:t>
+      </w:r>
+      <w:r>
+        <w:rPr>
+          <w:rFonts w:ascii="Noto Serif SC" w:eastAsia="Noto Serif SC" w:hAnsi="Noto Serif SC" w:cs="Noto Serif" w:hint="eastAsia"/>
+          <w:sz w:val="20"/>
+          <w:szCs w:val="20"/>
+        </w:rPr>
+        <w:t>管钟琴</w:t>
+      </w:r>
+      <w:r>
+        <w:rPr>
+          <w:rFonts w:ascii="Noto Serif SC" w:eastAsia="Noto Serif SC" w:hAnsi="Noto Serif SC" w:cs="Noto Serif"/>
+          <w:sz w:val="20"/>
+          <w:szCs w:val="20"/>
+        </w:rPr>
+        <w:t xml:space="preserve"> </w:t>
+      </w:r>
+      <w:proofErr w:type="spellStart"/>
+      <w:r>
+        <w:rPr>
+          <w:rFonts w:ascii="Noto Serif SC" w:eastAsia="Noto Serif SC" w:hAnsi="Noto Serif SC" w:cs="Noto Serif"/>
+          <w:sz w:val="20"/>
+          <w:szCs w:val="20"/>
+        </w:rPr>
+        <w:t>Tubaphone</w:t>
+      </w:r>
+      <w:proofErr w:type="spellEnd"/>
       <w:r>
         <w:rPr>
           <w:rFonts w:ascii="Noto Serif SC" w:eastAsia="Noto Serif SC" w:hAnsi="Noto Serif SC" w:cs="Noto Serif"/>
@@ -4700,742 +5262,116 @@
           <w:sz w:val="20"/>
           <w:szCs w:val="20"/>
         </w:rPr>
-        <w:t>颤音琴</w:t>
-      </w:r>
-      <w:r>
-        <w:rPr>
-          <w:rFonts w:ascii="Noto Serif SC" w:eastAsia="Noto Serif SC" w:hAnsi="Noto Serif SC" w:cs="Noto Serif"/>
-          <w:sz w:val="20"/>
-          <w:szCs w:val="20"/>
-        </w:rPr>
-        <w:t xml:space="preserve"> Vibraphone, </w:t>
-      </w:r>
-      <w:r>
-        <w:rPr>
-          <w:rFonts w:ascii="Noto Serif SC" w:eastAsia="Noto Serif SC" w:hAnsi="Noto Serif SC" w:cs="Noto Serif" w:hint="eastAsia"/>
-          <w:sz w:val="20"/>
-          <w:szCs w:val="20"/>
-        </w:rPr>
-        <w:t>大钹</w:t>
-      </w:r>
-      <w:r>
-        <w:rPr>
-          <w:rFonts w:ascii="Noto Serif SC" w:eastAsia="Noto Serif SC" w:hAnsi="Noto Serif SC" w:cs="Noto Serif"/>
-          <w:sz w:val="20"/>
-          <w:szCs w:val="20"/>
-        </w:rPr>
-        <w:t xml:space="preserve"> Dabo</w:t>
-      </w:r>
-      <w:r>
-        <w:rPr>
-          <w:rFonts w:ascii="Noto Serif SC" w:eastAsia="Noto Serif SC" w:hAnsi="Noto Serif SC" w:cs="Noto Serif"/>
-          <w:sz w:val="20"/>
-          <w:szCs w:val="20"/>
-        </w:rPr>
-        <w:t>,</w:t>
-      </w:r>
-      <w:r>
-        <w:rPr>
-          <w:rFonts w:ascii="Noto Serif SC" w:eastAsia="Noto Serif SC" w:hAnsi="Noto Serif SC" w:cs="Noto Serif"/>
-          <w:sz w:val="20"/>
-          <w:szCs w:val="20"/>
+        <w:t>小军鼓</w:t>
+      </w:r>
+      <w:r>
+        <w:rPr>
+          <w:rFonts w:ascii="Noto Serif SC" w:eastAsia="Noto Serif SC" w:hAnsi="Noto Serif SC" w:cs="Noto Serif"/>
+          <w:sz w:val="20"/>
+          <w:szCs w:val="20"/>
+        </w:rPr>
+        <w:t xml:space="preserve"> Snare Drum, </w:t>
+      </w:r>
+      <w:r>
+        <w:rPr>
+          <w:rFonts w:ascii="Noto Serif SC" w:eastAsia="Noto Serif SC" w:hAnsi="Noto Serif SC" w:cs="Noto Serif" w:hint="eastAsia"/>
+          <w:sz w:val="20"/>
+          <w:szCs w:val="20"/>
+        </w:rPr>
+        <w:t>编磬</w:t>
+      </w:r>
+      <w:r>
+        <w:rPr>
+          <w:rFonts w:ascii="Noto Serif SC" w:eastAsia="Noto Serif SC" w:hAnsi="Noto Serif SC" w:cs="Noto Serif"/>
+          <w:sz w:val="20"/>
+          <w:szCs w:val="20"/>
+        </w:rPr>
+        <w:t xml:space="preserve"> Bianqing</w:t>
+      </w:r>
+    </w:p>
+    <w:p>
+      <w:pPr>
+        <w:rPr>
+          <w:rFonts w:ascii="Noto Serif SC" w:eastAsia="Noto Serif SC" w:hAnsi="Noto Serif SC" w:cs="Noto Serif"/>
+          <w:sz w:val="24"/>
+          <w:szCs w:val="24"/>
+          <w:lang w:val="en-US"/>
+        </w:rPr>
+      </w:pPr>
+    </w:p>
+    <w:p>
+      <w:pPr>
+        <w:rPr>
+          <w:rFonts w:ascii="Noto Serif SC" w:eastAsia="Noto Serif SC" w:hAnsi="Noto Serif SC" w:cs="Noto Serif"/>
+          <w:sz w:val="24"/>
+          <w:szCs w:val="24"/>
+          <w:lang w:val="en-US"/>
+        </w:rPr>
+      </w:pPr>
+      <w:r>
+        <w:rPr>
+          <w:rFonts w:ascii="Noto Serif SC" w:eastAsia="Noto Serif SC" w:hAnsi="Noto Serif SC" w:cs="Noto Serif" w:hint="eastAsia"/>
+          <w:sz w:val="24"/>
+          <w:szCs w:val="24"/>
+        </w:rPr>
+        <w:t>竹笛独奏</w:t>
+      </w:r>
+      <w:r>
+        <w:rPr>
+          <w:rFonts w:ascii="Noto Serif SC" w:eastAsia="Noto Serif SC" w:hAnsi="Noto Serif SC" w:cs="Noto Serif"/>
+          <w:sz w:val="24"/>
+          <w:szCs w:val="24"/>
+          <w:lang w:val="en-US"/>
         </w:rPr>
         <w:t xml:space="preserve"> </w:t>
       </w:r>
-      <w:r>
-        <w:rPr>
-          <w:rFonts w:ascii="Noto Serif SC" w:eastAsia="Noto Serif SC" w:hAnsi="Noto Serif SC" w:cs="Noto Serif" w:hint="eastAsia"/>
-          <w:sz w:val="20"/>
-          <w:szCs w:val="20"/>
-        </w:rPr>
-        <w:t>排鼓</w:t>
-      </w:r>
-      <w:r>
-        <w:rPr>
-          <w:rFonts w:ascii="Noto Serif SC" w:eastAsia="Noto Serif SC" w:hAnsi="Noto Serif SC" w:cs="Noto Serif"/>
-          <w:sz w:val="20"/>
-          <w:szCs w:val="20"/>
+      <w:proofErr w:type="spellStart"/>
+      <w:r>
+        <w:rPr>
+          <w:rFonts w:ascii="Noto Serif SC" w:eastAsia="Noto Serif SC" w:hAnsi="Noto Serif SC" w:cs="Noto Serif"/>
+          <w:sz w:val="24"/>
+          <w:szCs w:val="24"/>
+          <w:lang w:val="en-US"/>
+        </w:rPr>
+        <w:t>Zhudi</w:t>
+      </w:r>
+      <w:proofErr w:type="spellEnd"/>
+      <w:r>
+        <w:rPr>
+          <w:rFonts w:ascii="Noto Serif SC" w:eastAsia="Noto Serif SC" w:hAnsi="Noto Serif SC" w:cs="Noto Serif"/>
+          <w:sz w:val="24"/>
+          <w:szCs w:val="24"/>
+          <w:lang w:val="en-US"/>
+        </w:rPr>
+        <w:t xml:space="preserve"> solo</w:t>
+      </w:r>
+    </w:p>
+    <w:p>
+      <w:pPr>
+        <w:rPr>
+          <w:rFonts w:ascii="Noto Serif SC" w:eastAsia="Noto Serif SC" w:hAnsi="Noto Serif SC" w:cs="Noto Serif"/>
+          <w:sz w:val="24"/>
+          <w:szCs w:val="24"/>
+          <w:lang w:val="en-US"/>
+        </w:rPr>
+      </w:pPr>
+      <w:r>
+        <w:rPr>
+          <w:rFonts w:ascii="Noto Serif SC" w:eastAsia="Noto Serif SC" w:hAnsi="Noto Serif SC" w:cs="Noto Serif" w:hint="eastAsia"/>
+          <w:sz w:val="24"/>
+          <w:szCs w:val="24"/>
+        </w:rPr>
+        <w:t>琵琶独奏</w:t>
+      </w:r>
+      <w:r>
+        <w:rPr>
+          <w:rFonts w:ascii="Noto Serif SC" w:eastAsia="Noto Serif SC" w:hAnsi="Noto Serif SC" w:cs="Noto Serif"/>
+          <w:sz w:val="24"/>
+          <w:szCs w:val="24"/>
+          <w:lang w:val="en-US"/>
         </w:rPr>
         <w:t xml:space="preserve"> </w:t>
       </w:r>
-      <w:proofErr w:type="spellStart"/>
-      <w:r>
-        <w:rPr>
-          <w:rFonts w:ascii="Noto Serif SC" w:eastAsia="Noto Serif SC" w:hAnsi="Noto Serif SC" w:cs="Noto Serif"/>
-          <w:sz w:val="20"/>
-          <w:szCs w:val="20"/>
-        </w:rPr>
-        <w:t>Paigu</w:t>
-      </w:r>
-      <w:proofErr w:type="spellEnd"/>
-      <w:r>
-        <w:rPr>
-          <w:rFonts w:ascii="Noto Serif SC" w:eastAsia="Noto Serif SC" w:hAnsi="Noto Serif SC" w:cs="Noto Serif"/>
-          <w:sz w:val="20"/>
-          <w:szCs w:val="20"/>
-        </w:rPr>
-        <w:t xml:space="preserve">, </w:t>
-      </w:r>
-      <w:r>
-        <w:rPr>
-          <w:rFonts w:ascii="Noto Serif SC" w:eastAsia="Noto Serif SC" w:hAnsi="Noto Serif SC" w:cs="Noto Serif" w:hint="eastAsia"/>
-          <w:sz w:val="20"/>
-          <w:szCs w:val="20"/>
-        </w:rPr>
-        <w:t>军镲</w:t>
-      </w:r>
-      <w:r>
-        <w:rPr>
-          <w:rFonts w:ascii="Noto Serif SC" w:eastAsia="Noto Serif SC" w:hAnsi="Noto Serif SC" w:cs="Noto Serif"/>
-          <w:sz w:val="20"/>
-          <w:szCs w:val="20"/>
-        </w:rPr>
-        <w:t xml:space="preserve"> Cymbals</w:t>
-      </w:r>
-      <w:r>
-        <w:rPr>
-          <w:rFonts w:ascii="Noto Serif SC" w:eastAsia="Noto Serif SC" w:hAnsi="Noto Serif SC" w:cs="Noto Serif"/>
-          <w:sz w:val="20"/>
-          <w:szCs w:val="20"/>
-        </w:rPr>
-        <w:t>,</w:t>
-      </w:r>
-      <w:r>
-        <w:rPr>
-          <w:rFonts w:ascii="Noto Serif SC" w:eastAsia="Noto Serif SC" w:hAnsi="Noto Serif SC" w:cs="Noto Serif"/>
-          <w:sz w:val="20"/>
-          <w:szCs w:val="20"/>
-        </w:rPr>
-        <w:t xml:space="preserve"> </w:t>
-      </w:r>
-      <w:r>
-        <w:rPr>
-          <w:rFonts w:ascii="Noto Serif SC" w:eastAsia="Noto Serif SC" w:hAnsi="Noto Serif SC" w:cs="Noto Serif" w:hint="eastAsia"/>
-          <w:sz w:val="20"/>
-          <w:szCs w:val="20"/>
-        </w:rPr>
-        <w:t>通通鼓</w:t>
-      </w:r>
-      <w:r>
-        <w:rPr>
-          <w:rFonts w:ascii="Noto Serif SC" w:eastAsia="Noto Serif SC" w:hAnsi="Noto Serif SC" w:cs="Noto Serif"/>
-          <w:sz w:val="20"/>
-          <w:szCs w:val="20"/>
-        </w:rPr>
-        <w:t xml:space="preserve"> Tom-toms</w:t>
-      </w:r>
-    </w:p>
-    <w:p>
-      <w:pPr>
-        <w:ind w:left="288"/>
-        <w:rPr>
-          <w:rFonts w:ascii="Noto Serif SC" w:eastAsia="Noto Serif SC" w:hAnsi="Noto Serif SC" w:cs="Noto Serif"/>
-          <w:sz w:val="20"/>
-          <w:szCs w:val="20"/>
-        </w:rPr>
-      </w:pPr>
-      <w:r>
-        <w:rPr>
-          <w:rFonts w:ascii="Noto Serif SC" w:eastAsia="Noto Serif SC" w:hAnsi="Noto Serif SC" w:cs="Noto Serif"/>
-          <w:sz w:val="20"/>
-          <w:szCs w:val="20"/>
-          <w:lang w:val="en-US"/>
-        </w:rPr>
-        <w:t xml:space="preserve">III: </w:t>
-      </w:r>
-      <w:r>
-        <w:rPr>
-          <w:rFonts w:ascii="Noto Serif SC" w:eastAsia="Noto Serif SC" w:hAnsi="Noto Serif SC" w:cs="Noto Serif" w:hint="eastAsia"/>
-          <w:sz w:val="20"/>
-          <w:szCs w:val="20"/>
-        </w:rPr>
-        <w:t>木琴</w:t>
-      </w:r>
-      <w:r>
-        <w:rPr>
-          <w:rFonts w:ascii="Noto Serif SC" w:eastAsia="Noto Serif SC" w:hAnsi="Noto Serif SC" w:cs="Noto Serif"/>
-          <w:sz w:val="20"/>
-          <w:szCs w:val="20"/>
-        </w:rPr>
-        <w:t xml:space="preserve"> Xylophone, </w:t>
-      </w:r>
-      <w:r>
-        <w:rPr>
-          <w:rFonts w:ascii="Noto Serif SC" w:eastAsia="Noto Serif SC" w:hAnsi="Noto Serif SC" w:cs="Noto Serif" w:hint="eastAsia"/>
-          <w:sz w:val="20"/>
-          <w:szCs w:val="20"/>
-        </w:rPr>
-        <w:t>通通鼓</w:t>
-      </w:r>
-      <w:r>
-        <w:rPr>
-          <w:rFonts w:ascii="Noto Serif SC" w:eastAsia="Noto Serif SC" w:hAnsi="Noto Serif SC" w:cs="Noto Serif"/>
-          <w:sz w:val="20"/>
-          <w:szCs w:val="20"/>
-        </w:rPr>
-        <w:t xml:space="preserve"> Tom-toms, </w:t>
-      </w:r>
-      <w:r>
-        <w:rPr>
-          <w:rFonts w:ascii="Noto Serif SC" w:eastAsia="Noto Serif SC" w:hAnsi="Noto Serif SC" w:cs="Noto Serif" w:hint="eastAsia"/>
-          <w:sz w:val="20"/>
-          <w:szCs w:val="20"/>
-        </w:rPr>
-        <w:t>乐鞭</w:t>
-      </w:r>
-      <w:r>
-        <w:rPr>
-          <w:rFonts w:ascii="Noto Serif SC" w:eastAsia="Noto Serif SC" w:hAnsi="Noto Serif SC" w:cs="Noto Serif"/>
-          <w:sz w:val="20"/>
-          <w:szCs w:val="20"/>
-        </w:rPr>
-        <w:t xml:space="preserve"> Whip, </w:t>
-      </w:r>
-      <w:r>
-        <w:rPr>
-          <w:rFonts w:ascii="Noto Serif SC" w:eastAsia="Noto Serif SC" w:hAnsi="Noto Serif SC" w:cs="Noto Serif" w:hint="eastAsia"/>
-          <w:sz w:val="20"/>
-          <w:szCs w:val="20"/>
-        </w:rPr>
-        <w:t>康嘎鼓</w:t>
-      </w:r>
-      <w:r>
-        <w:rPr>
-          <w:rFonts w:ascii="Noto Serif SC" w:eastAsia="Noto Serif SC" w:hAnsi="Noto Serif SC" w:cs="Noto Serif"/>
-          <w:sz w:val="20"/>
-          <w:szCs w:val="20"/>
-        </w:rPr>
-        <w:t xml:space="preserve"> Congas</w:t>
-      </w:r>
-    </w:p>
-    <w:p>
-      <w:pPr>
-        <w:ind w:left="288"/>
-        <w:rPr>
-          <w:rFonts w:ascii="Noto Serif SC" w:eastAsia="Noto Serif SC" w:hAnsi="Noto Serif SC" w:cs="Noto Serif"/>
-          <w:sz w:val="20"/>
-          <w:szCs w:val="20"/>
-        </w:rPr>
-      </w:pPr>
-      <w:r>
-        <w:rPr>
-          <w:rFonts w:ascii="Noto Serif SC" w:eastAsia="Noto Serif SC" w:hAnsi="Noto Serif SC" w:cs="Noto Serif"/>
-          <w:sz w:val="20"/>
-          <w:szCs w:val="20"/>
-          <w:lang w:val="en-US"/>
-        </w:rPr>
-        <w:t xml:space="preserve">IV: </w:t>
-      </w:r>
-      <w:r>
-        <w:rPr>
-          <w:rFonts w:ascii="Noto Serif SC" w:eastAsia="Noto Serif SC" w:hAnsi="Noto Serif SC" w:cs="Noto Serif" w:hint="eastAsia"/>
-          <w:sz w:val="20"/>
-          <w:szCs w:val="20"/>
-        </w:rPr>
-        <w:t>编钟</w:t>
-      </w:r>
-      <w:r>
-        <w:rPr>
-          <w:rFonts w:ascii="Noto Serif SC" w:eastAsia="Noto Serif SC" w:hAnsi="Noto Serif SC" w:cs="Noto Serif"/>
-          <w:sz w:val="20"/>
-          <w:szCs w:val="20"/>
-        </w:rPr>
-        <w:t xml:space="preserve"> </w:t>
-      </w:r>
-      <w:proofErr w:type="spellStart"/>
-      <w:r>
-        <w:rPr>
-          <w:rFonts w:ascii="Noto Serif SC" w:eastAsia="Noto Serif SC" w:hAnsi="Noto Serif SC" w:cs="Noto Serif"/>
-          <w:sz w:val="20"/>
-          <w:szCs w:val="20"/>
-        </w:rPr>
-        <w:t>Bianzhong</w:t>
-      </w:r>
-      <w:proofErr w:type="spellEnd"/>
-      <w:r>
-        <w:rPr>
-          <w:rFonts w:ascii="Noto Serif SC" w:eastAsia="Noto Serif SC" w:hAnsi="Noto Serif SC" w:cs="Noto Serif"/>
-          <w:sz w:val="20"/>
-          <w:szCs w:val="20"/>
-        </w:rPr>
-        <w:t xml:space="preserve">, </w:t>
-      </w:r>
-      <w:r>
-        <w:rPr>
-          <w:rFonts w:ascii="Noto Serif SC" w:eastAsia="Noto Serif SC" w:hAnsi="Noto Serif SC" w:cs="Noto Serif" w:hint="eastAsia"/>
-          <w:sz w:val="20"/>
-          <w:szCs w:val="20"/>
-        </w:rPr>
-        <w:t>通通鼓</w:t>
-      </w:r>
-      <w:r>
-        <w:rPr>
-          <w:rFonts w:ascii="Noto Serif SC" w:eastAsia="Noto Serif SC" w:hAnsi="Noto Serif SC" w:cs="Noto Serif"/>
-          <w:sz w:val="20"/>
-          <w:szCs w:val="20"/>
-        </w:rPr>
-        <w:t xml:space="preserve"> Tom-toms, </w:t>
-      </w:r>
-      <w:r>
-        <w:rPr>
-          <w:rFonts w:ascii="Noto Serif SC" w:eastAsia="Noto Serif SC" w:hAnsi="Noto Serif SC" w:cs="Noto Serif" w:hint="eastAsia"/>
-          <w:sz w:val="20"/>
-          <w:szCs w:val="20"/>
-        </w:rPr>
-        <w:t>马林巴</w:t>
-      </w:r>
-      <w:r>
-        <w:rPr>
-          <w:rFonts w:ascii="Noto Serif SC" w:eastAsia="Noto Serif SC" w:hAnsi="Noto Serif SC" w:cs="Noto Serif"/>
-          <w:sz w:val="20"/>
-          <w:szCs w:val="20"/>
-        </w:rPr>
-        <w:t xml:space="preserve"> Marimba, </w:t>
-      </w:r>
-      <w:r>
-        <w:rPr>
-          <w:rFonts w:ascii="Noto Serif SC" w:eastAsia="Noto Serif SC" w:hAnsi="Noto Serif SC" w:cs="Noto Serif" w:hint="eastAsia"/>
-          <w:sz w:val="20"/>
-          <w:szCs w:val="20"/>
-        </w:rPr>
-        <w:t>军镲</w:t>
-      </w:r>
-      <w:r>
-        <w:rPr>
-          <w:rFonts w:ascii="Noto Serif SC" w:eastAsia="Noto Serif SC" w:hAnsi="Noto Serif SC" w:cs="Noto Serif"/>
-          <w:sz w:val="20"/>
-          <w:szCs w:val="20"/>
-        </w:rPr>
-        <w:t xml:space="preserve"> </w:t>
-      </w:r>
-      <w:r>
-        <w:rPr>
-          <w:rFonts w:ascii="Noto Serif SC" w:eastAsia="Noto Serif SC" w:hAnsi="Noto Serif SC" w:cs="Noto Serif"/>
-          <w:sz w:val="20"/>
-          <w:szCs w:val="20"/>
-        </w:rPr>
-        <w:t>C</w:t>
-      </w:r>
-      <w:r>
-        <w:rPr>
-          <w:rFonts w:ascii="Noto Serif SC" w:eastAsia="Noto Serif SC" w:hAnsi="Noto Serif SC" w:cs="Noto Serif"/>
-          <w:sz w:val="20"/>
-          <w:szCs w:val="20"/>
-        </w:rPr>
-        <w:t>ymbals</w:t>
-      </w:r>
-    </w:p>
-    <w:p>
-      <w:pPr>
-        <w:ind w:left="288"/>
-        <w:rPr>
-          <w:rFonts w:ascii="Noto Serif SC" w:eastAsia="Noto Serif SC" w:hAnsi="Noto Serif SC" w:cs="Noto Serif"/>
-          <w:sz w:val="20"/>
-          <w:szCs w:val="20"/>
-        </w:rPr>
-      </w:pPr>
-      <w:r>
-        <w:rPr>
-          <w:rFonts w:ascii="Noto Serif SC" w:eastAsia="Noto Serif SC" w:hAnsi="Noto Serif SC" w:cs="Noto Serif"/>
-          <w:sz w:val="20"/>
-          <w:szCs w:val="20"/>
-          <w:lang w:val="en-US"/>
-        </w:rPr>
-        <w:t xml:space="preserve">V: </w:t>
-      </w:r>
-      <w:r>
-        <w:rPr>
-          <w:rFonts w:ascii="Noto Serif SC" w:eastAsia="Noto Serif SC" w:hAnsi="Noto Serif SC" w:cs="Noto Serif" w:hint="eastAsia"/>
-          <w:sz w:val="20"/>
-          <w:szCs w:val="20"/>
-        </w:rPr>
-        <w:t>铓锣</w:t>
-      </w:r>
-      <w:r>
-        <w:rPr>
-          <w:rFonts w:ascii="Noto Serif SC" w:eastAsia="Noto Serif SC" w:hAnsi="Noto Serif SC" w:cs="Noto Serif"/>
-          <w:sz w:val="20"/>
-          <w:szCs w:val="20"/>
-        </w:rPr>
-        <w:t xml:space="preserve"> </w:t>
-      </w:r>
-      <w:proofErr w:type="spellStart"/>
-      <w:r>
-        <w:rPr>
-          <w:rFonts w:ascii="Noto Serif SC" w:eastAsia="Noto Serif SC" w:hAnsi="Noto Serif SC" w:cs="Noto Serif"/>
-          <w:sz w:val="20"/>
-          <w:szCs w:val="20"/>
-        </w:rPr>
-        <w:t>Mangluo</w:t>
-      </w:r>
-      <w:proofErr w:type="spellEnd"/>
-      <w:r>
-        <w:rPr>
-          <w:rFonts w:ascii="Noto Serif SC" w:eastAsia="Noto Serif SC" w:hAnsi="Noto Serif SC" w:cs="Noto Serif"/>
-          <w:sz w:val="20"/>
-          <w:szCs w:val="20"/>
-        </w:rPr>
-        <w:t xml:space="preserve">, </w:t>
-      </w:r>
-      <w:r>
-        <w:rPr>
-          <w:rFonts w:ascii="Noto Serif SC" w:eastAsia="Noto Serif SC" w:hAnsi="Noto Serif SC" w:cs="Noto Serif" w:hint="eastAsia"/>
-          <w:sz w:val="20"/>
-          <w:szCs w:val="20"/>
-        </w:rPr>
-        <w:t>颤音琴</w:t>
-      </w:r>
-      <w:r>
-        <w:rPr>
-          <w:rFonts w:ascii="Noto Serif SC" w:eastAsia="Noto Serif SC" w:hAnsi="Noto Serif SC" w:cs="Noto Serif"/>
-          <w:sz w:val="20"/>
-          <w:szCs w:val="20"/>
-        </w:rPr>
-        <w:t xml:space="preserve"> Vibraphone</w:t>
-      </w:r>
-      <w:r>
-        <w:rPr>
-          <w:rFonts w:ascii="Noto Serif SC" w:eastAsia="Noto Serif SC" w:hAnsi="Noto Serif SC" w:cs="Noto Serif"/>
-          <w:sz w:val="20"/>
-          <w:szCs w:val="20"/>
-        </w:rPr>
-        <w:t>,</w:t>
-      </w:r>
-      <w:r>
-        <w:rPr>
-          <w:rFonts w:ascii="Noto Serif SC" w:eastAsia="Noto Serif SC" w:hAnsi="Noto Serif SC" w:cs="Noto Serif"/>
-          <w:sz w:val="20"/>
-          <w:szCs w:val="20"/>
-        </w:rPr>
-        <w:t xml:space="preserve"> </w:t>
-      </w:r>
-      <w:r>
-        <w:rPr>
-          <w:rFonts w:ascii="Noto Serif SC" w:eastAsia="Noto Serif SC" w:hAnsi="Noto Serif SC" w:cs="Noto Serif" w:hint="eastAsia"/>
-          <w:sz w:val="20"/>
-          <w:szCs w:val="20"/>
-        </w:rPr>
-        <w:t>编钟</w:t>
-      </w:r>
-      <w:r>
-        <w:rPr>
-          <w:rFonts w:ascii="Noto Serif SC" w:eastAsia="Noto Serif SC" w:hAnsi="Noto Serif SC" w:cs="Noto Serif"/>
-          <w:sz w:val="20"/>
-          <w:szCs w:val="20"/>
-        </w:rPr>
-        <w:t xml:space="preserve"> </w:t>
-      </w:r>
-      <w:proofErr w:type="spellStart"/>
-      <w:r>
-        <w:rPr>
-          <w:rFonts w:ascii="Noto Serif SC" w:eastAsia="Noto Serif SC" w:hAnsi="Noto Serif SC" w:cs="Noto Serif"/>
-          <w:sz w:val="20"/>
-          <w:szCs w:val="20"/>
-        </w:rPr>
-        <w:t>Bianzhong</w:t>
-      </w:r>
-      <w:proofErr w:type="spellEnd"/>
-      <w:r>
-        <w:rPr>
-          <w:rFonts w:ascii="Noto Serif SC" w:eastAsia="Noto Serif SC" w:hAnsi="Noto Serif SC" w:cs="Noto Serif"/>
-          <w:sz w:val="20"/>
-          <w:szCs w:val="20"/>
-        </w:rPr>
-        <w:t xml:space="preserve">, </w:t>
-      </w:r>
-      <w:r>
-        <w:rPr>
-          <w:rFonts w:ascii="Noto Serif SC" w:eastAsia="Noto Serif SC" w:hAnsi="Noto Serif SC" w:cs="Noto Serif" w:hint="eastAsia"/>
-          <w:sz w:val="20"/>
-          <w:szCs w:val="20"/>
-        </w:rPr>
-        <w:t>大军鼓</w:t>
-      </w:r>
-      <w:r>
-        <w:rPr>
-          <w:rFonts w:ascii="Noto Serif SC" w:eastAsia="Noto Serif SC" w:hAnsi="Noto Serif SC" w:cs="Noto Serif"/>
-          <w:sz w:val="20"/>
-          <w:szCs w:val="20"/>
-        </w:rPr>
-        <w:t xml:space="preserve"> Bass </w:t>
-      </w:r>
-      <w:r>
-        <w:rPr>
-          <w:rFonts w:ascii="Noto Serif SC" w:eastAsia="Noto Serif SC" w:hAnsi="Noto Serif SC" w:cs="Noto Serif"/>
-          <w:sz w:val="20"/>
-          <w:szCs w:val="20"/>
-        </w:rPr>
-        <w:t>D</w:t>
-      </w:r>
-      <w:r>
-        <w:rPr>
-          <w:rFonts w:ascii="Noto Serif SC" w:eastAsia="Noto Serif SC" w:hAnsi="Noto Serif SC" w:cs="Noto Serif"/>
-          <w:sz w:val="20"/>
-          <w:szCs w:val="20"/>
-        </w:rPr>
-        <w:t xml:space="preserve">rum, </w:t>
-      </w:r>
-      <w:r>
-        <w:rPr>
-          <w:rFonts w:ascii="Noto Serif SC" w:eastAsia="Noto Serif SC" w:hAnsi="Noto Serif SC" w:cs="Noto Serif" w:hint="eastAsia"/>
-          <w:sz w:val="20"/>
-          <w:szCs w:val="20"/>
-        </w:rPr>
-        <w:t>大锣</w:t>
-      </w:r>
-      <w:r>
-        <w:rPr>
-          <w:rFonts w:ascii="Noto Serif SC" w:eastAsia="Noto Serif SC" w:hAnsi="Noto Serif SC" w:cs="Noto Serif"/>
-          <w:sz w:val="20"/>
-          <w:szCs w:val="20"/>
-        </w:rPr>
-        <w:t xml:space="preserve"> </w:t>
-      </w:r>
-      <w:proofErr w:type="spellStart"/>
-      <w:r>
-        <w:rPr>
-          <w:rFonts w:ascii="Noto Serif SC" w:eastAsia="Noto Serif SC" w:hAnsi="Noto Serif SC" w:cs="Noto Serif"/>
-          <w:sz w:val="20"/>
-          <w:szCs w:val="20"/>
-        </w:rPr>
-        <w:t>Daluo</w:t>
-      </w:r>
-      <w:proofErr w:type="spellEnd"/>
-    </w:p>
-    <w:p>
-      <w:pPr>
-        <w:ind w:left="288"/>
-        <w:rPr>
-          <w:rFonts w:ascii="Noto Serif SC" w:eastAsia="Noto Serif SC" w:hAnsi="Noto Serif SC" w:cs="Noto Serif"/>
-          <w:sz w:val="20"/>
-          <w:szCs w:val="20"/>
-          <w:lang w:val="en-US"/>
-        </w:rPr>
-      </w:pPr>
-      <w:r>
-        <w:rPr>
-          <w:rFonts w:ascii="Noto Serif SC" w:eastAsia="Noto Serif SC" w:hAnsi="Noto Serif SC" w:cs="Noto Serif"/>
-          <w:sz w:val="20"/>
-          <w:szCs w:val="20"/>
-        </w:rPr>
-        <w:t xml:space="preserve">VI: </w:t>
-      </w:r>
-      <w:r>
-        <w:rPr>
-          <w:rFonts w:ascii="Noto Serif SC" w:eastAsia="Noto Serif SC" w:hAnsi="Noto Serif SC" w:cs="Noto Serif"/>
-          <w:sz w:val="20"/>
-          <w:szCs w:val="20"/>
-        </w:rPr>
-        <w:t>(</w:t>
-      </w:r>
-      <w:r>
-        <w:rPr>
-          <w:rFonts w:ascii="Noto Serif SC" w:eastAsia="Noto Serif SC" w:hAnsi="Noto Serif SC" w:cs="Noto Serif" w:hint="eastAsia"/>
-          <w:sz w:val="20"/>
-          <w:szCs w:val="20"/>
-        </w:rPr>
-        <w:t>中国</w:t>
-      </w:r>
-      <w:r>
-        <w:rPr>
-          <w:rFonts w:ascii="Noto Serif SC" w:eastAsia="Noto Serif SC" w:hAnsi="Noto Serif SC" w:cs="Noto Serif"/>
-          <w:sz w:val="20"/>
-          <w:szCs w:val="20"/>
-        </w:rPr>
-        <w:t>)</w:t>
-      </w:r>
-      <w:r>
-        <w:rPr>
-          <w:rFonts w:ascii="Noto Serif SC" w:eastAsia="Noto Serif SC" w:hAnsi="Noto Serif SC" w:cs="Noto Serif" w:hint="eastAsia"/>
-          <w:sz w:val="20"/>
-          <w:szCs w:val="20"/>
-        </w:rPr>
-        <w:t>大鼓</w:t>
-      </w:r>
-      <w:r>
-        <w:rPr>
-          <w:rFonts w:ascii="Noto Serif SC" w:eastAsia="Noto Serif SC" w:hAnsi="Noto Serif SC" w:cs="Noto Serif"/>
-          <w:sz w:val="20"/>
-          <w:szCs w:val="20"/>
-        </w:rPr>
-        <w:t xml:space="preserve"> </w:t>
-      </w:r>
-      <w:proofErr w:type="spellStart"/>
-      <w:r>
-        <w:rPr>
-          <w:rFonts w:ascii="Noto Serif SC" w:eastAsia="Noto Serif SC" w:hAnsi="Noto Serif SC" w:cs="Noto Serif"/>
-          <w:sz w:val="20"/>
-          <w:szCs w:val="20"/>
-        </w:rPr>
-        <w:t>Dagu</w:t>
-      </w:r>
-      <w:proofErr w:type="spellEnd"/>
-      <w:r>
-        <w:rPr>
-          <w:rFonts w:ascii="Noto Serif SC" w:eastAsia="Noto Serif SC" w:hAnsi="Noto Serif SC" w:cs="Noto Serif"/>
-          <w:sz w:val="20"/>
-          <w:szCs w:val="20"/>
-        </w:rPr>
-        <w:t>,</w:t>
-      </w:r>
-      <w:r>
-        <w:rPr>
-          <w:rFonts w:ascii="Noto Serif SC" w:eastAsia="Noto Serif SC" w:hAnsi="Noto Serif SC" w:cs="Noto Serif"/>
-          <w:sz w:val="20"/>
-          <w:szCs w:val="20"/>
-        </w:rPr>
-        <w:t xml:space="preserve"> </w:t>
-      </w:r>
-      <w:r>
-        <w:rPr>
-          <w:rFonts w:ascii="Noto Serif SC" w:eastAsia="Noto Serif SC" w:hAnsi="Noto Serif SC" w:cs="Noto Serif" w:hint="eastAsia"/>
-          <w:sz w:val="20"/>
-          <w:szCs w:val="20"/>
-        </w:rPr>
-        <w:t>管钟琴</w:t>
-      </w:r>
-      <w:r>
-        <w:rPr>
-          <w:rFonts w:ascii="Noto Serif SC" w:eastAsia="Noto Serif SC" w:hAnsi="Noto Serif SC" w:cs="Noto Serif"/>
-          <w:sz w:val="20"/>
-          <w:szCs w:val="20"/>
-        </w:rPr>
-        <w:t xml:space="preserve"> </w:t>
-      </w:r>
-      <w:proofErr w:type="spellStart"/>
-      <w:r>
-        <w:rPr>
-          <w:rFonts w:ascii="Noto Serif SC" w:eastAsia="Noto Serif SC" w:hAnsi="Noto Serif SC" w:cs="Noto Serif"/>
-          <w:sz w:val="20"/>
-          <w:szCs w:val="20"/>
-        </w:rPr>
-        <w:t>Tubaphone</w:t>
-      </w:r>
-      <w:proofErr w:type="spellEnd"/>
-      <w:r>
-        <w:rPr>
-          <w:rFonts w:ascii="Noto Serif SC" w:eastAsia="Noto Serif SC" w:hAnsi="Noto Serif SC" w:cs="Noto Serif"/>
-          <w:sz w:val="20"/>
-          <w:szCs w:val="20"/>
-        </w:rPr>
-        <w:t xml:space="preserve">, </w:t>
-      </w:r>
-      <w:r>
-        <w:rPr>
-          <w:rFonts w:ascii="Noto Serif SC" w:eastAsia="Noto Serif SC" w:hAnsi="Noto Serif SC" w:cs="Noto Serif" w:hint="eastAsia"/>
-          <w:sz w:val="20"/>
-          <w:szCs w:val="20"/>
-        </w:rPr>
-        <w:t>小军鼓</w:t>
-      </w:r>
-      <w:r>
-        <w:rPr>
-          <w:rFonts w:ascii="Noto Serif SC" w:eastAsia="Noto Serif SC" w:hAnsi="Noto Serif SC" w:cs="Noto Serif"/>
-          <w:sz w:val="20"/>
-          <w:szCs w:val="20"/>
-        </w:rPr>
-        <w:t xml:space="preserve"> Snare Drum, </w:t>
-      </w:r>
-      <w:r>
-        <w:rPr>
-          <w:rFonts w:ascii="Noto Serif SC" w:eastAsia="Noto Serif SC" w:hAnsi="Noto Serif SC" w:cs="Noto Serif" w:hint="eastAsia"/>
-          <w:sz w:val="20"/>
-          <w:szCs w:val="20"/>
-        </w:rPr>
-        <w:t>编磬</w:t>
-      </w:r>
-      <w:r>
-        <w:rPr>
-          <w:rFonts w:ascii="Noto Serif SC" w:eastAsia="Noto Serif SC" w:hAnsi="Noto Serif SC" w:cs="Noto Serif"/>
-          <w:sz w:val="20"/>
-          <w:szCs w:val="20"/>
-        </w:rPr>
-        <w:t xml:space="preserve"> Bianqing</w:t>
-      </w:r>
-    </w:p>
-    <w:p>
-      <w:pPr>
-        <w:rPr>
-          <w:rFonts w:ascii="Noto Serif SC" w:eastAsia="Noto Serif SC" w:hAnsi="Noto Serif SC" w:cs="Noto Serif"/>
-          <w:sz w:val="24"/>
-          <w:szCs w:val="24"/>
-          <w:lang w:val="en-US"/>
-        </w:rPr>
-      </w:pPr>
-    </w:p>
-    <w:p>
-      <w:pPr>
-        <w:rPr>
-          <w:rFonts w:ascii="Noto Serif SC" w:eastAsia="Noto Serif SC" w:hAnsi="Noto Serif SC" w:cs="Noto Serif"/>
-          <w:sz w:val="24"/>
-          <w:szCs w:val="24"/>
-          <w:lang w:val="en-US"/>
-        </w:rPr>
-      </w:pPr>
-      <w:r>
-        <w:rPr>
-          <w:rFonts w:ascii="Noto Serif SC" w:eastAsia="Noto Serif SC" w:hAnsi="Noto Serif SC" w:cs="Noto Serif" w:hint="eastAsia"/>
-          <w:sz w:val="24"/>
-          <w:szCs w:val="24"/>
-        </w:rPr>
-        <w:t>竹笛独奏</w:t>
-      </w:r>
-      <w:r>
-        <w:rPr>
-          <w:rFonts w:ascii="Noto Serif SC" w:eastAsia="Noto Serif SC" w:hAnsi="Noto Serif SC" w:cs="Noto Serif"/>
-          <w:sz w:val="24"/>
-          <w:szCs w:val="24"/>
-          <w:lang w:val="en-US"/>
-        </w:rPr>
-        <w:t xml:space="preserve"> </w:t>
-      </w:r>
-      <w:proofErr w:type="spellStart"/>
-      <w:r>
-        <w:rPr>
-          <w:rFonts w:ascii="Noto Serif SC" w:eastAsia="Noto Serif SC" w:hAnsi="Noto Serif SC" w:cs="Noto Serif"/>
-          <w:sz w:val="24"/>
-          <w:szCs w:val="24"/>
-          <w:lang w:val="en-US"/>
-        </w:rPr>
-        <w:t>Zhudi</w:t>
-      </w:r>
-      <w:proofErr w:type="spellEnd"/>
-      <w:r>
-        <w:rPr>
-          <w:rFonts w:ascii="Noto Serif SC" w:eastAsia="Noto Serif SC" w:hAnsi="Noto Serif SC" w:cs="Noto Serif"/>
-          <w:sz w:val="24"/>
-          <w:szCs w:val="24"/>
-          <w:lang w:val="en-US"/>
-        </w:rPr>
-        <w:t xml:space="preserve"> solo</w:t>
-      </w:r>
-    </w:p>
-    <w:p>
-      <w:pPr>
-        <w:rPr>
-          <w:rFonts w:ascii="Noto Serif SC" w:eastAsia="Noto Serif SC" w:hAnsi="Noto Serif SC" w:cs="Noto Serif"/>
-          <w:sz w:val="24"/>
-          <w:szCs w:val="24"/>
-          <w:lang w:val="en-US"/>
-        </w:rPr>
-      </w:pPr>
-      <w:r>
-        <w:rPr>
-          <w:rFonts w:ascii="Noto Serif SC" w:eastAsia="Noto Serif SC" w:hAnsi="Noto Serif SC" w:cs="Noto Serif" w:hint="eastAsia"/>
-          <w:sz w:val="24"/>
-          <w:szCs w:val="24"/>
-        </w:rPr>
-        <w:t>琵琶独奏</w:t>
-      </w:r>
-      <w:r>
-        <w:rPr>
-          <w:rFonts w:ascii="Noto Serif SC" w:eastAsia="Noto Serif SC" w:hAnsi="Noto Serif SC" w:cs="Noto Serif"/>
-          <w:sz w:val="24"/>
-          <w:szCs w:val="24"/>
-          <w:lang w:val="en-US"/>
-        </w:rPr>
-        <w:t xml:space="preserve"> </w:t>
-      </w:r>
       <w:r>
         <w:rPr>
           <w:rFonts w:ascii="Noto Serif SC" w:eastAsia="Noto Serif SC" w:hAnsi="Noto Serif SC" w:cs="Noto Serif"/>
@@ -5667,7 +5603,6 @@
     </w:p>
     <w:p>
       <w:pPr>
-        <w:spacing w:after="640"/>
         <w:rPr>
           <w:rFonts w:ascii="Noto Serif SC" w:eastAsia="Noto Serif SC" w:hAnsi="Noto Serif SC" w:cs="Noto Serif"/>
           <w:b/>
@@ -5715,7 +5650,6 @@
     </w:p>
     <w:p>
       <w:pPr>
-        <w:spacing w:after="240"/>
         <w:rPr>
           <w:rFonts w:ascii="Noto Serif SC" w:eastAsia="Noto Serif SC" w:hAnsi="Noto Serif SC" w:cs="Noto Serif"/>
           <w:b/>
@@ -5723,16 +5657,16 @@
           <w:szCs w:val="32"/>
         </w:rPr>
       </w:pPr>
-      <w:r>
-        <w:rPr>
-          <w:rFonts w:ascii="Noto Serif SC" w:eastAsia="Noto Serif SC" w:hAnsi="Noto Serif SC" w:cs="Noto Serif" w:hint="eastAsia"/>
+    </w:p>
+    <w:p>
+      <w:pPr>
+        <w:rPr>
+          <w:rFonts w:ascii="Noto Serif SC" w:eastAsia="Noto Serif SC" w:hAnsi="Noto Serif SC" w:cs="Noto Serif"/>
           <w:b/>
           <w:sz w:val="32"/>
           <w:szCs w:val="32"/>
         </w:rPr>
-        <w:t xml:space="preserve">独奏竹笛 Solo </w:t>
-      </w:r>
-      <w:proofErr w:type="spellStart"/>
+      </w:pPr>
       <w:r>
         <w:rPr>
           <w:rFonts w:ascii="Noto Serif SC" w:eastAsia="Noto Serif SC" w:hAnsi="Noto Serif SC" w:cs="Noto Serif" w:hint="eastAsia"/>
@@ -5740,25 +5674,16 @@
           <w:sz w:val="32"/>
           <w:szCs w:val="32"/>
         </w:rPr>
-        <w:t>Zhudi</w:t>
-      </w:r>
-      <w:proofErr w:type="spellEnd"/>
-      <w:r>
-        <w:rPr>
-          <w:rFonts w:ascii="Noto Serif SC" w:eastAsia="Noto Serif SC" w:hAnsi="Noto Serif SC" w:cs="Noto Serif" w:hint="eastAsia"/>
-          <w:b/>
-          <w:sz w:val="32"/>
-          <w:szCs w:val="32"/>
-        </w:rPr>
-        <w:t>:</w:t>
-      </w:r>
-    </w:p>
-    <w:p>
-      <w:pPr>
-        <w:ind w:left="360" w:firstLine="720"/>
-        <w:rPr>
-          <w:rFonts w:ascii="Noto Serif SC" w:eastAsia="Noto Serif SC" w:hAnsi="Noto Serif SC" w:cs="Noto Serif"/>
-          <w:bCs/>
+        <w:t>独奏竹笛 Solo Zhudi:</w:t>
+      </w:r>
+    </w:p>
+    <w:p>
+      <w:pPr>
+        <w:ind w:left="720" w:firstLine="720"/>
+        <w:rPr>
+          <w:rFonts w:ascii="Noto Serif SC" w:eastAsia="Noto Serif SC" w:hAnsi="Noto Serif SC" w:cs="Noto Serif"/>
+          <w:bCs/>
+          <w:lang w:val="en-GB"/>
         </w:rPr>
       </w:pPr>
       <w:r>
@@ -5842,7 +5767,7 @@
                 <v:stroke joinstyle="miter"/>
                 <v:path gradientshapeok="t" o:connecttype="rect" textboxrect="5400,5400,16200,16200"/>
               </v:shapetype>
-              <v:shape id="Diamond 1" o:spid="_x0000_s1026" type="#_x0000_t4" style="position:absolute;margin-left:18.1pt;margin-top:5.7pt;width:20pt;height:13.7pt;z-index:251658240;visibility:visible;mso-wrap-style:square;mso-width-percent:0;mso-height-percent:0;mso-wrap-distance-left:9pt;mso-wrap-distance-top:0;mso-wrap-distance-right:9pt;mso-wrap-distance-bottom:0;mso-position-horizontal:absolute;mso-position-horizontal-relative:margin;mso-position-vertical:absolute;mso-position-vertical-relative:text;mso-width-percent:0;mso-height-percent:0;mso-width-relative:margin;mso-height-relative:margin;v-text-anchor:middle" o:gfxdata="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" filled="f" strokecolor="black [3213]" strokeweight="1pt">
+              <v:shape id="Diamond 1" o:spid="_x0000_s1026" type="#_x0000_t4" style="position:absolute;margin-left:18.1pt;margin-top:5.7pt;width:20pt;height:13.7pt;z-index:251658240;visibility:visible;mso-wrap-style:square;mso-width-percent:0;mso-height-percent:0;mso-wrap-distance-left:9pt;mso-wrap-distance-top:0;mso-wrap-distance-right:9pt;mso-wrap-distance-bottom:0;mso-position-horizontal:absolute;mso-position-horizontal-relative:margin;mso-position-vertical:absolute;mso-position-vertical-relative:text;mso-width-percent:0;mso-height-percent:0;mso-width-relative:margin;mso-height-relative:margin;v-text-anchor:middle" o:gfxdata="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" filled="f" strokecolor="black [3213]" strokeweight="1pt">
                 <w10:wrap anchorx="margin"/>
               </v:shape>
             </w:pict>
@@ -5851,14 +5776,6 @@
       </w:r>
       <w:r>
         <w:rPr>
-          <w:rFonts w:ascii="Noto Serif SC" w:eastAsia="Noto Serif SC" w:hAnsi="Noto Serif SC" w:cs="Noto Serif"/>
-          <w:bCs/>
-          <w:lang w:val="en-US"/>
-        </w:rPr>
-        <w:t xml:space="preserve">       </w:t>
-      </w:r>
-      <w:r>
-        <w:rPr>
           <w:rFonts w:ascii="Noto Serif SC" w:eastAsia="Noto Serif SC" w:hAnsi="Noto Serif SC" w:cs="Noto Serif" w:hint="eastAsia"/>
           <w:bCs/>
         </w:rPr>
@@ -5879,6 +5796,14 @@
         </w:rPr>
         <w:t>(嘴唇稍微离开吹孔，并能够同时听到音高和吹气的噪音)。</w:t>
       </w:r>
+      <w:r>
+        <w:rPr>
+          <w:rFonts w:ascii="Noto Serif SC" w:eastAsia="Noto Serif SC" w:hAnsi="Noto Serif SC" w:cs="Noto Serif"/>
+          <w:bCs/>
+          <w:lang w:val="en-GB"/>
+        </w:rPr>
+        <w:t xml:space="preserve"> Breathy tone (keep lips slightly away).</w:t>
+      </w:r>
     </w:p>
     <w:p>
       <w:pPr>
@@ -5886,6 +5811,7 @@
         <w:rPr>
           <w:rFonts w:ascii="Noto Serif SC" w:eastAsia="Noto Serif SC" w:hAnsi="Noto Serif SC" w:cs="Noto Serif"/>
           <w:bCs/>
+          <w:lang w:val="en-GB"/>
         </w:rPr>
       </w:pPr>
       <w:r>
@@ -5916,6 +5842,138 @@
         </w:rPr>
         <w:t>：意为气息颤动。</w:t>
       </w:r>
+      <w:r>
+        <w:rPr>
+          <w:rFonts w:ascii="Noto Serif SC" w:eastAsia="Noto Serif SC" w:hAnsi="Noto Serif SC" w:cs="Noto Serif" w:hint="eastAsia"/>
+          <w:bCs/>
+        </w:rPr>
+        <w:t>Turbulent air</w:t>
+      </w:r>
+      <w:r>
+        <w:rPr>
+          <w:rFonts w:ascii="Noto Serif SC" w:eastAsia="Noto Serif SC" w:hAnsi="Noto Serif SC" w:cs="Noto Serif"/>
+          <w:bCs/>
+        </w:rPr>
+        <w:t>.</w:t>
+      </w:r>
+    </w:p>
+    <w:p>
+      <w:pPr>
+        <w:ind w:left="1440" w:hanging="1080"/>
+        <w:rPr>
+          <w:rFonts w:ascii="Noto Serif SC" w:eastAsia="Noto Serif SC" w:hAnsi="Noto Serif SC" w:cs="Noto Serif" w:hint="eastAsia"/>
+          <w:bCs/>
+          <w:lang w:val="en-GB"/>
+        </w:rPr>
+      </w:pPr>
+      <w:r>
+        <w:rPr>
+          <w:rFonts w:ascii="Noto Serif SC" w:eastAsia="Noto Serif SC" w:hAnsi="Noto Serif SC" w:cs="Noto Serif" w:hint="eastAsia"/>
+          <w:bCs/>
+        </w:rPr>
+        <w:t>ord.</w:t>
+      </w:r>
+      <w:r>
+        <w:rPr>
+          <w:rFonts w:ascii="Noto Serif SC" w:eastAsia="Noto Serif SC" w:hAnsi="Noto Serif SC" w:cs="Noto Serif"/>
+          <w:bCs/>
+        </w:rPr>
+        <w:tab/>
+      </w:r>
+      <w:r>
+        <w:rPr>
+          <w:rFonts w:ascii="Noto Serif SC" w:eastAsia="Noto Serif SC" w:hAnsi="Noto Serif SC" w:cs="Noto Serif" w:hint="eastAsia"/>
+          <w:bCs/>
+        </w:rPr>
+        <w:t>：正常演奏</w:t>
+      </w:r>
+      <w:r>
+        <w:rPr>
+          <w:rFonts w:ascii="Noto Serif SC" w:eastAsia="Noto Serif SC" w:hAnsi="Noto Serif SC" w:cs="Noto Serif" w:hint="eastAsia"/>
+          <w:bCs/>
+        </w:rPr>
+        <w:t>（</w:t>
+      </w:r>
+      <w:proofErr w:type="spellStart"/>
+      <w:r>
+        <w:rPr>
+          <w:rFonts w:ascii="Noto Serif SC" w:eastAsia="Noto Serif SC" w:hAnsi="Noto Serif SC" w:cs="Noto Serif" w:hint="eastAsia"/>
+          <w:bCs/>
+          <w:i/>
+          <w:iCs/>
+        </w:rPr>
+        <w:t>ordinar</w:t>
+      </w:r>
+      <w:r>
+        <w:rPr>
+          <w:rFonts w:ascii="Noto Serif SC" w:eastAsia="Noto Serif SC" w:hAnsi="Noto Serif SC" w:cs="Noto Serif"/>
+          <w:bCs/>
+          <w:i/>
+          <w:iCs/>
+        </w:rPr>
+        <w:t>io</w:t>
+      </w:r>
+      <w:proofErr w:type="spellEnd"/>
+      <w:r>
+        <w:rPr>
+          <w:rFonts w:ascii="Noto Serif SC" w:eastAsia="Noto Serif SC" w:hAnsi="Noto Serif SC" w:cs="Noto Serif" w:hint="eastAsia"/>
+          <w:bCs/>
+        </w:rPr>
+        <w:t>，</w:t>
+      </w:r>
+      <w:r>
+        <w:rPr>
+          <w:rFonts w:ascii="Noto Serif SC" w:eastAsia="Noto Serif SC" w:hAnsi="Noto Serif SC" w:cs="Noto Serif" w:hint="eastAsia"/>
+          <w:bCs/>
+        </w:rPr>
+        <w:t>包括正常的颤动、正常的口唇与吹孔的距离关系等</w:t>
+      </w:r>
+      <w:r>
+        <w:rPr>
+          <w:rFonts w:ascii="Noto Serif SC" w:eastAsia="Noto Serif SC" w:hAnsi="Noto Serif SC" w:cs="Noto Serif"/>
+          <w:bCs/>
+        </w:rPr>
+        <w:t>）</w:t>
+      </w:r>
+      <w:r>
+        <w:rPr>
+          <w:rFonts w:ascii="Noto Serif SC" w:eastAsia="Noto Serif SC" w:hAnsi="Noto Serif SC" w:cs="Noto Serif" w:hint="eastAsia"/>
+          <w:bCs/>
+        </w:rPr>
+        <w:t>。</w:t>
+      </w:r>
+      <w:r>
+        <w:rPr>
+          <w:rFonts w:ascii="Noto Serif SC" w:eastAsia="Noto Serif SC" w:hAnsi="Noto Serif SC" w:cs="Noto Serif"/>
+          <w:bCs/>
+          <w:lang w:val="en-GB"/>
+        </w:rPr>
+        <w:t xml:space="preserve"> </w:t>
+      </w:r>
+      <w:r>
+        <w:rPr>
+          <w:rFonts w:ascii="Noto Serif SC" w:eastAsia="Noto Serif SC" w:hAnsi="Noto Serif SC" w:cs="Noto Serif" w:hint="eastAsia"/>
+          <w:bCs/>
+          <w:lang w:val="en-GB"/>
+        </w:rPr>
+        <w:t>N</w:t>
+      </w:r>
+      <w:r>
+        <w:rPr>
+          <w:rFonts w:ascii="Noto Serif SC" w:eastAsia="Noto Serif SC" w:hAnsi="Noto Serif SC" w:cs="Noto Serif"/>
+          <w:bCs/>
+          <w:lang w:val="en-GB"/>
+        </w:rPr>
+        <w:t>ormal playing technique</w:t>
+      </w:r>
+      <w:r>
+        <w:rPr>
+          <w:rFonts w:ascii="Noto Serif SC" w:eastAsia="Noto Serif SC" w:hAnsi="Noto Serif SC" w:cs="Noto Serif" w:hint="eastAsia"/>
+          <w:bCs/>
+          <w:lang w:val="en-GB"/>
+        </w:rPr>
+        <w:t>; cancels out any previous technical instructions.</w:t>
+      </w:r>
     </w:p>
     <w:p>
       <w:pPr>
@@ -5923,14 +5981,24 @@
         <w:rPr>
           <w:rFonts w:ascii="Noto Serif SC" w:eastAsia="Noto Serif SC" w:hAnsi="Noto Serif SC" w:cs="Noto Serif"/>
           <w:bCs/>
-        </w:rPr>
-      </w:pPr>
-      <w:r>
-        <w:rPr>
-          <w:rFonts w:ascii="Noto Serif SC" w:eastAsia="Noto Serif SC" w:hAnsi="Noto Serif SC" w:cs="Noto Serif" w:hint="eastAsia"/>
-          <w:bCs/>
-        </w:rPr>
-        <w:t>ord.</w:t>
+          <w:lang w:val="en-GB"/>
+        </w:rPr>
+      </w:pPr>
+      <w:proofErr w:type="spellStart"/>
+      <w:r>
+        <w:rPr>
+          <w:rFonts w:ascii="Noto Serif SC" w:eastAsia="Noto Serif SC" w:hAnsi="Noto Serif SC" w:cs="Noto Serif" w:hint="eastAsia"/>
+          <w:bCs/>
+        </w:rPr>
+        <w:t>gliss</w:t>
+      </w:r>
+      <w:proofErr w:type="spellEnd"/>
+      <w:r>
+        <w:rPr>
+          <w:rFonts w:ascii="Noto Serif SC" w:eastAsia="Noto Serif SC" w:hAnsi="Noto Serif SC" w:cs="Noto Serif" w:hint="eastAsia"/>
+          <w:bCs/>
+        </w:rPr>
+        <w:t>.</w:t>
       </w:r>
       <w:r>
         <w:rPr>
@@ -5944,15 +6012,24 @@
           <w:rFonts w:ascii="Noto Serif SC" w:eastAsia="Noto Serif SC" w:hAnsi="Noto Serif SC" w:cs="Noto Serif" w:hint="eastAsia"/>
           <w:bCs/>
         </w:rPr>
-        <w:t>：正常演奏(ordinary,包括正常的颤动、正常的口唇与吹孔的距离关系等)。</w:t>
+        <w:t>：指滑音或气滑音。</w:t>
+      </w:r>
+      <w:r>
+        <w:rPr>
+          <w:rFonts w:ascii="Noto Serif SC" w:eastAsia="Noto Serif SC" w:hAnsi="Noto Serif SC" w:cs="Noto Serif"/>
+          <w:bCs/>
+          <w:lang w:val="en-GB"/>
+        </w:rPr>
+        <w:t>Includes regular and wind (pitch bend) glissandi.</w:t>
       </w:r>
     </w:p>
     <w:p>
       <w:pPr>
         <w:ind w:left="360"/>
         <w:rPr>
-          <w:rFonts w:ascii="Noto Serif SC" w:eastAsia="Noto Serif SC" w:hAnsi="Noto Serif SC" w:cs="Noto Serif"/>
-          <w:bCs/>
+          <w:rFonts w:ascii="Noto Serif SC" w:eastAsia="Noto Serif SC" w:hAnsi="Noto Serif SC" w:cs="Noto Serif" w:hint="eastAsia"/>
+          <w:bCs/>
+          <w:lang w:val="en-GB"/>
         </w:rPr>
       </w:pPr>
       <w:proofErr w:type="spellStart"/>
@@ -5961,7 +6038,7 @@
           <w:rFonts w:ascii="Noto Serif SC" w:eastAsia="Noto Serif SC" w:hAnsi="Noto Serif SC" w:cs="Noto Serif" w:hint="eastAsia"/>
           <w:bCs/>
         </w:rPr>
-        <w:t>gliss</w:t>
+        <w:t>vib</w:t>
       </w:r>
       <w:proofErr w:type="spellEnd"/>
       <w:r>
@@ -5983,17 +6060,87 @@
           <w:rFonts w:ascii="Noto Serif SC" w:eastAsia="Noto Serif SC" w:hAnsi="Noto Serif SC" w:cs="Noto Serif" w:hint="eastAsia"/>
           <w:bCs/>
         </w:rPr>
-        <w:t>：指滑音或气滑音。</w:t>
+        <w:t>：颤动</w:t>
+      </w:r>
+      <w:r>
+        <w:rPr>
+          <w:rFonts w:ascii="Noto Serif SC" w:eastAsia="Noto Serif SC" w:hAnsi="Noto Serif SC" w:cs="Noto Serif" w:hint="eastAsia"/>
+          <w:bCs/>
+        </w:rPr>
+        <w:t>，</w:t>
+      </w:r>
+      <w:r>
+        <w:rPr>
+          <w:rFonts w:ascii="Noto Serif SC" w:eastAsia="Noto Serif SC" w:hAnsi="Noto Serif SC" w:cs="Noto Serif" w:hint="eastAsia"/>
+          <w:bCs/>
+        </w:rPr>
+        <w:t>颤吟</w:t>
+      </w:r>
+      <w:r>
+        <w:rPr>
+          <w:rFonts w:ascii="Noto Serif SC" w:eastAsia="Noto Serif SC" w:hAnsi="Noto Serif SC" w:cs="Noto Serif" w:hint="eastAsia"/>
+          <w:bCs/>
+        </w:rPr>
+        <w:t>（</w:t>
+      </w:r>
+      <w:r>
+        <w:rPr>
+          <w:rFonts w:ascii="Noto Serif SC" w:eastAsia="Noto Serif SC" w:hAnsi="Noto Serif SC" w:cs="Noto Serif" w:hint="eastAsia"/>
+          <w:bCs/>
+        </w:rPr>
+        <w:t>专指通过气流大小的改变造成</w:t>
+      </w:r>
+      <w:r>
+        <w:rPr>
+          <w:rFonts w:ascii="Noto Serif SC" w:eastAsia="Noto Serif SC" w:hAnsi="Noto Serif SC" w:cs="Noto Serif" w:hint="eastAsia"/>
+          <w:bCs/>
+        </w:rPr>
+        <w:t>，</w:t>
+      </w:r>
+      <w:r>
+        <w:rPr>
+          <w:rFonts w:ascii="Noto Serif SC" w:eastAsia="Noto Serif SC" w:hAnsi="Noto Serif SC" w:cs="Noto Serif" w:hint="eastAsia"/>
+          <w:bCs/>
+        </w:rPr>
+        <w:t>不含指法的变化</w:t>
+      </w:r>
+      <w:r>
+        <w:rPr>
+          <w:rFonts w:ascii="Noto Serif SC" w:eastAsia="Noto Serif SC" w:hAnsi="Noto Serif SC" w:cs="Noto Serif" w:hint="eastAsia"/>
+          <w:bCs/>
+        </w:rPr>
+        <w:t>）</w:t>
+      </w:r>
+      <w:r>
+        <w:rPr>
+          <w:rFonts w:ascii="Noto Serif SC" w:eastAsia="Noto Serif SC" w:hAnsi="Noto Serif SC" w:cs="Noto Serif" w:hint="eastAsia"/>
+          <w:bCs/>
+        </w:rPr>
+        <w:t>。 Vibrato</w:t>
+      </w:r>
+      <w:r>
+        <w:rPr>
+          <w:rFonts w:ascii="Noto Serif SC" w:eastAsia="Noto Serif SC" w:hAnsi="Noto Serif SC" w:cs="Noto Serif" w:hint="eastAsia"/>
+          <w:bCs/>
+        </w:rPr>
+        <w:t xml:space="preserve"> (includes wind vibrato).</w:t>
       </w:r>
     </w:p>
     <w:p>
       <w:pPr>
         <w:ind w:left="360"/>
         <w:rPr>
-          <w:rFonts w:ascii="Noto Serif SC" w:eastAsia="Noto Serif SC" w:hAnsi="Noto Serif SC" w:cs="Noto Serif"/>
-          <w:bCs/>
-        </w:rPr>
-      </w:pPr>
+          <w:rFonts w:ascii="Noto Serif SC" w:eastAsia="Noto Serif SC" w:hAnsi="Noto Serif SC" w:cs="Noto Serif" w:hint="eastAsia"/>
+          <w:bCs/>
+        </w:rPr>
+      </w:pPr>
+      <w:r>
+        <w:rPr>
+          <w:rFonts w:ascii="Noto Serif SC" w:eastAsia="Noto Serif SC" w:hAnsi="Noto Serif SC" w:cs="Noto Serif" w:hint="eastAsia"/>
+          <w:bCs/>
+        </w:rPr>
+        <w:t xml:space="preserve">quasi </w:t>
+      </w:r>
       <w:proofErr w:type="spellStart"/>
       <w:r>
         <w:rPr>
@@ -6022,23 +6169,80 @@
           <w:rFonts w:ascii="Noto Serif SC" w:eastAsia="Noto Serif SC" w:hAnsi="Noto Serif SC" w:cs="Noto Serif" w:hint="eastAsia"/>
           <w:bCs/>
         </w:rPr>
-        <w:t>：颤动,颤吟(专指通过气流大小的改变造成,不含指法的变化)</w:t>
+        <w:t>：十分强烈</w:t>
+      </w:r>
+      <w:r>
+        <w:rPr>
+          <w:rFonts w:ascii="Noto Serif SC" w:eastAsia="Noto Serif SC" w:hAnsi="Noto Serif SC" w:cs="Noto Serif" w:hint="eastAsia"/>
+          <w:bCs/>
+        </w:rPr>
+        <w:t>，</w:t>
+      </w:r>
+      <w:r>
+        <w:rPr>
+          <w:rFonts w:ascii="Noto Serif SC" w:eastAsia="Noto Serif SC" w:hAnsi="Noto Serif SC" w:cs="Noto Serif" w:hint="eastAsia"/>
+          <w:bCs/>
+        </w:rPr>
+        <w:t>甚至有些夸张和乖戾的颤动和颤吟</w:t>
+      </w:r>
+      <w:r>
+        <w:rPr>
+          <w:rFonts w:ascii="Noto Serif SC" w:eastAsia="Noto Serif SC" w:hAnsi="Noto Serif SC" w:cs="Noto Serif" w:hint="eastAsia"/>
+          <w:bCs/>
+        </w:rPr>
+        <w:t>（</w:t>
+      </w:r>
+      <w:r>
+        <w:rPr>
+          <w:rFonts w:ascii="Noto Serif SC" w:eastAsia="Noto Serif SC" w:hAnsi="Noto Serif SC" w:cs="Noto Serif" w:hint="eastAsia"/>
+          <w:bCs/>
+        </w:rPr>
+        <w:t>通过气流大小的改变造成,不含指法的变化</w:t>
+      </w:r>
+      <w:r>
+        <w:rPr>
+          <w:rFonts w:ascii="Noto Serif SC" w:eastAsia="Noto Serif SC" w:hAnsi="Noto Serif SC" w:cs="Noto Serif" w:hint="eastAsia"/>
+          <w:bCs/>
+        </w:rPr>
+        <w:t>）</w:t>
+      </w:r>
+      <w:r>
+        <w:rPr>
+          <w:rFonts w:ascii="Noto Serif SC" w:eastAsia="Noto Serif SC" w:hAnsi="Noto Serif SC" w:cs="Noto Serif" w:hint="eastAsia"/>
+          <w:bCs/>
+        </w:rPr>
+        <w:t>。</w:t>
+      </w:r>
+      <w:r>
+        <w:rPr>
+          <w:rFonts w:ascii="Noto Serif SC" w:eastAsia="Noto Serif SC" w:hAnsi="Noto Serif SC" w:cs="Noto Serif" w:hint="eastAsia"/>
+          <w:bCs/>
+        </w:rPr>
+        <w:t xml:space="preserve"> </w:t>
+      </w:r>
+      <w:r>
+        <w:rPr>
+          <w:rFonts w:ascii="Noto Serif SC" w:eastAsia="Noto Serif SC" w:hAnsi="Noto Serif SC" w:cs="Noto Serif" w:hint="eastAsia"/>
+          <w:bCs/>
+        </w:rPr>
+        <w:t>Exaggerated vibrato.</w:t>
       </w:r>
     </w:p>
     <w:p>
       <w:pPr>
         <w:ind w:left="360"/>
         <w:rPr>
-          <w:rFonts w:ascii="Noto Serif SC" w:eastAsia="Noto Serif SC" w:hAnsi="Noto Serif SC" w:cs="Noto Serif"/>
-          <w:bCs/>
-        </w:rPr>
-      </w:pPr>
-      <w:r>
-        <w:rPr>
-          <w:rFonts w:ascii="Noto Serif SC" w:eastAsia="Noto Serif SC" w:hAnsi="Noto Serif SC" w:cs="Noto Serif" w:hint="eastAsia"/>
-          <w:bCs/>
-        </w:rPr>
-        <w:t xml:space="preserve">quasi </w:t>
+          <w:rFonts w:ascii="Noto Serif SC" w:eastAsia="Noto Serif SC" w:hAnsi="Noto Serif SC" w:cs="Noto Serif" w:hint="eastAsia"/>
+          <w:bCs/>
+          <w:lang w:val="en-GB"/>
+        </w:rPr>
+      </w:pPr>
+      <w:r>
+        <w:rPr>
+          <w:rFonts w:ascii="Noto Serif SC" w:eastAsia="Noto Serif SC" w:hAnsi="Noto Serif SC" w:cs="Noto Serif" w:hint="eastAsia"/>
+          <w:bCs/>
+        </w:rPr>
+        <w:t xml:space="preserve">non </w:t>
       </w:r>
       <w:proofErr w:type="spellStart"/>
       <w:r>
@@ -6061,52 +6265,6 @@
           <w:rFonts w:ascii="Noto Serif SC" w:eastAsia="Noto Serif SC" w:hAnsi="Noto Serif SC" w:cs="Noto Serif"/>
           <w:bCs/>
         </w:rPr>
-        <w:t xml:space="preserve"> </w:t>
-      </w:r>
-      <w:r>
-        <w:rPr>
-          <w:rFonts w:ascii="Noto Serif SC" w:eastAsia="Noto Serif SC" w:hAnsi="Noto Serif SC" w:cs="Noto Serif" w:hint="eastAsia"/>
-          <w:bCs/>
-        </w:rPr>
-        <w:t>：十分强烈,甚至有些夸张和乖戾的颤动和颤吟(通过气流大小的改变造成,不含指法的变化)。</w:t>
-      </w:r>
-    </w:p>
-    <w:p>
-      <w:pPr>
-        <w:ind w:left="360"/>
-        <w:rPr>
-          <w:rFonts w:ascii="Noto Serif SC" w:eastAsia="Noto Serif SC" w:hAnsi="Noto Serif SC" w:cs="Noto Serif"/>
-          <w:bCs/>
-        </w:rPr>
-      </w:pPr>
-      <w:r>
-        <w:rPr>
-          <w:rFonts w:ascii="Noto Serif SC" w:eastAsia="Noto Serif SC" w:hAnsi="Noto Serif SC" w:cs="Noto Serif" w:hint="eastAsia"/>
-          <w:bCs/>
-        </w:rPr>
-        <w:t xml:space="preserve">non </w:t>
-      </w:r>
-      <w:proofErr w:type="spellStart"/>
-      <w:r>
-        <w:rPr>
-          <w:rFonts w:ascii="Noto Serif SC" w:eastAsia="Noto Serif SC" w:hAnsi="Noto Serif SC" w:cs="Noto Serif" w:hint="eastAsia"/>
-          <w:bCs/>
-        </w:rPr>
-        <w:t>vib</w:t>
-      </w:r>
-      <w:proofErr w:type="spellEnd"/>
-      <w:r>
-        <w:rPr>
-          <w:rFonts w:ascii="Noto Serif SC" w:eastAsia="Noto Serif SC" w:hAnsi="Noto Serif SC" w:cs="Noto Serif" w:hint="eastAsia"/>
-          <w:bCs/>
-        </w:rPr>
-        <w:t>.</w:t>
-      </w:r>
-      <w:r>
-        <w:rPr>
-          <w:rFonts w:ascii="Noto Serif SC" w:eastAsia="Noto Serif SC" w:hAnsi="Noto Serif SC" w:cs="Noto Serif"/>
-          <w:bCs/>
-        </w:rPr>
         <w:tab/>
       </w:r>
       <w:r>
@@ -6115,6 +6273,13 @@
           <w:bCs/>
         </w:rPr>
         <w:t>：没有任何颤动和颤吟。</w:t>
+      </w:r>
+      <w:r>
+        <w:rPr>
+          <w:rFonts w:ascii="Noto Serif SC" w:eastAsia="Noto Serif SC" w:hAnsi="Noto Serif SC" w:cs="Noto Serif" w:hint="eastAsia"/>
+          <w:bCs/>
+        </w:rPr>
+        <w:t>No vibrato at all.</w:t>
       </w:r>
     </w:p>
     <w:p>
@@ -6152,29 +6317,127 @@
           <w:rFonts w:ascii="Noto Serif SC" w:eastAsia="Noto Serif SC" w:hAnsi="Noto Serif SC" w:cs="Noto Serif"/>
           <w:bCs/>
         </w:rPr>
-        <w:t xml:space="preserve">             </w:t>
-      </w:r>
-      <w:r>
-        <w:rPr>
-          <w:rFonts w:ascii="Noto Serif SC" w:eastAsia="Noto Serif SC" w:hAnsi="Noto Serif SC" w:cs="Noto Serif" w:hint="eastAsia"/>
-          <w:bCs/>
-        </w:rPr>
-        <w:t>：为基础音与其上方小二度的颤音(无论处在什么调性环境下)。</w:t>
-      </w:r>
-    </w:p>
-    <w:p>
-      <w:pPr>
-        <w:rPr>
-          <w:rFonts w:ascii="Noto Serif SC" w:eastAsia="Noto Serif SC" w:hAnsi="Noto Serif SC" w:cs="Noto Serif"/>
-          <w:bCs/>
-          <w:sz w:val="24"/>
-          <w:szCs w:val="24"/>
-        </w:rPr>
-      </w:pPr>
-    </w:p>
-    <w:p>
-      <w:pPr>
-        <w:spacing w:after="240"/>
+        <w:tab/>
+      </w:r>
+      <w:r>
+        <w:rPr>
+          <w:rFonts w:ascii="Noto Serif SC" w:eastAsia="Noto Serif SC" w:hAnsi="Noto Serif SC" w:cs="Noto Serif" w:hint="eastAsia"/>
+          <w:bCs/>
+        </w:rPr>
+        <w:t>：为基础音与其上方小二度的颤音</w:t>
+      </w:r>
+      <w:r>
+        <w:rPr>
+          <w:rFonts w:ascii="Noto Serif SC" w:eastAsia="Noto Serif SC" w:hAnsi="Noto Serif SC" w:cs="Noto Serif" w:hint="eastAsia"/>
+          <w:bCs/>
+        </w:rPr>
+        <w:t>（</w:t>
+      </w:r>
+      <w:r>
+        <w:rPr>
+          <w:rFonts w:ascii="Noto Serif SC" w:eastAsia="Noto Serif SC" w:hAnsi="Noto Serif SC" w:cs="Noto Serif" w:hint="eastAsia"/>
+          <w:bCs/>
+        </w:rPr>
+        <w:t>无论处在什么调性环境下</w:t>
+      </w:r>
+      <w:r>
+        <w:rPr>
+          <w:rFonts w:ascii="Noto Serif SC" w:eastAsia="Noto Serif SC" w:hAnsi="Noto Serif SC" w:cs="Noto Serif" w:hint="eastAsia"/>
+          <w:bCs/>
+        </w:rPr>
+        <w:t>）</w:t>
+      </w:r>
+      <w:r>
+        <w:rPr>
+          <w:rFonts w:ascii="Noto Serif SC" w:eastAsia="Noto Serif SC" w:hAnsi="Noto Serif SC" w:cs="Noto Serif" w:hint="eastAsia"/>
+          <w:bCs/>
+        </w:rPr>
+        <w:t>。</w:t>
+      </w:r>
+      <w:r>
+        <w:rPr>
+          <w:rFonts w:ascii="Noto Serif SC" w:eastAsia="Noto Serif SC" w:hAnsi="Noto Serif SC" w:cs="Noto Serif" w:hint="eastAsia"/>
+          <w:bCs/>
+        </w:rPr>
+        <w:t xml:space="preserve"> </w:t>
+      </w:r>
+      <w:r>
+        <w:rPr>
+          <w:rFonts w:ascii="Noto Serif SC" w:eastAsia="Noto Serif SC" w:hAnsi="Noto Serif SC" w:cs="Noto Serif" w:hint="eastAsia"/>
+          <w:bCs/>
+        </w:rPr>
+        <w:t xml:space="preserve">Trill. </w:t>
+      </w:r>
+      <w:r>
+        <w:rPr>
+          <w:rFonts w:ascii="Noto Serif SC" w:eastAsia="Noto Serif SC" w:hAnsi="Noto Serif SC" w:cs="Noto Serif"/>
+          <w:bCs/>
+          <w:lang w:val="en-GB"/>
+        </w:rPr>
+        <w:t xml:space="preserve">The top note is </w:t>
+      </w:r>
+      <w:r>
+        <w:rPr>
+          <w:rFonts w:ascii="Noto Serif SC" w:eastAsia="Noto Serif SC" w:hAnsi="Noto Serif SC" w:cs="Noto Serif"/>
+          <w:b/>
+          <w:lang w:val="en-GB"/>
+        </w:rPr>
+        <w:t>always</w:t>
+      </w:r>
+      <w:r>
+        <w:rPr>
+          <w:rFonts w:ascii="Noto Serif SC" w:eastAsia="Noto Serif SC" w:hAnsi="Noto Serif SC" w:cs="Noto Serif"/>
+          <w:bCs/>
+          <w:lang w:val="en-GB"/>
+        </w:rPr>
+        <w:t xml:space="preserve"> a minor second above </w:t>
+      </w:r>
+      <w:r>
+        <w:rPr>
+          <w:rFonts w:ascii="Noto Serif SC" w:eastAsia="Noto Serif SC" w:hAnsi="Noto Serif SC" w:cs="Noto Serif"/>
+          <w:bCs/>
+          <w:lang w:val="en-GB"/>
+        </w:rPr>
+        <w:tab/>
+        <w:t xml:space="preserve">     </w:t>
+      </w:r>
+      <w:r>
+        <w:rPr>
+          <w:rFonts w:ascii="Noto Serif SC" w:eastAsia="Noto Serif SC" w:hAnsi="Noto Serif SC" w:cs="Noto Serif"/>
+          <w:bCs/>
+          <w:lang w:val="en-GB"/>
+        </w:rPr>
+        <w:t>the fundamental note (regardless of key signature or pr</w:t>
+      </w:r>
+      <w:r>
+        <w:rPr>
+          <w:rFonts w:ascii="Noto Serif SC" w:eastAsia="Noto Serif SC" w:hAnsi="Noto Serif SC" w:cs="Noto Serif"/>
+          <w:bCs/>
+          <w:lang w:val="en-GB"/>
+        </w:rPr>
+        <w:t>e</w:t>
+      </w:r>
+      <w:r>
+        <w:rPr>
+          <w:rFonts w:ascii="Noto Serif SC" w:eastAsia="Noto Serif SC" w:hAnsi="Noto Serif SC" w:cs="Noto Serif"/>
+          <w:bCs/>
+          <w:lang w:val="en-GB"/>
+        </w:rPr>
+        <w:t xml:space="preserve">ceding accidental). </w:t>
+      </w:r>
+    </w:p>
+    <w:p>
+      <w:pPr>
+        <w:rPr>
+          <w:rFonts w:ascii="Noto Serif SC" w:eastAsia="Noto Serif SC" w:hAnsi="Noto Serif SC" w:cs="Noto Serif"/>
+          <w:bCs/>
+          <w:sz w:val="24"/>
+          <w:szCs w:val="24"/>
+        </w:rPr>
+      </w:pPr>
+    </w:p>
+    <w:p>
+      <w:pPr>
         <w:rPr>
           <w:rFonts w:ascii="Noto Serif SC" w:eastAsia="Noto Serif SC" w:hAnsi="Noto Serif SC" w:cs="Noto Serif"/>
           <w:b/>
@@ -6757,7 +7020,7 @@
         <mc:AlternateContent>
           <mc:Choice Requires="wpg">
             <w:drawing>
-              <wp:inline distT="0" distB="0" distL="0" distR="0" wp14:anchorId="23967F80" wp14:editId="0B9D06BD">
+              <wp:inline distT="0" distB="0" distL="0" distR="0" wp14:anchorId="23967F80" wp14:editId="0B8B085B">
                 <wp:extent cx="422816" cy="135890"/>
                 <wp:effectExtent l="0" t="0" r="0" b="0"/>
                 <wp:docPr id="228028590" name="Group 6"/>
@@ -6955,8 +7218,8 @@
           <w:noProof/>
         </w:rPr>
         <w:pict w14:anchorId="62D7E167">
-          <v:shape id="Picture 7" o:spid="_x0000_i1026" type="#_x0000_t75" alt="A black background with a black square&#13;&#13;&#13;&#13;&#13;&#13;&#13;&#13;&#13;&#13;&#13;&#10;&#13;&#13;&#13;&#13;&#13;&#13;&#13;&#13;&#13;&#13;&#13;&#10;Description automatically generated with medium confidence" style="width:8pt;height:13.7pt;visibility:visible;mso-wrap-style:square;mso-width-percent:0;mso-height-percent:0;mso-width-percent:0;mso-height-percent:0">
-            <v:imagedata r:id="rId19" o:title="A black background with a black square&#13;&#13;&#13;&#13;&#13;&#13;&#13;&#13;&#13;&#13;&#13;&#10;&#13;&#13;&#13;&#13;&#13;&#13;&#13;&#13;&#13;&#13;&#13;&#10;Description automatically generated with medium confidence"/>
+          <v:shape id="Picture 7" o:spid="_x0000_i1027" type="#_x0000_t75" alt="A black background with a black square&#10;&#10;&#10;&#10;&#10;&#10;&#10;&#10;&#10;&#10;&#10;&#10;&#10;&#10;&#10;&#10;&#10;&#10;&#10;&#10;&#10;&#10;&#10;&#10;Description automatically generated with medium confidence" style="width:7.95pt;height:13.55pt;visibility:visible;mso-wrap-style:square;mso-width-percent:0;mso-height-percent:0;mso-width-percent:0;mso-height-percent:0">
+            <v:imagedata r:id="rId19" o:title="A black background with a black square&#10;&#10;&#10;&#10;&#10;&#10;&#10;&#10;&#10;&#10;&#10;&#10;&#10;&#10;&#10;&#10;&#10;&#10;&#10;&#10;&#10;&#10;&#10;&#10;Description automatically generated with medium confidence"/>
           </v:shape>
         </w:pict>
       </w:r>
@@ -7034,14 +7297,64 @@
       </w:pPr>
       <w:r>
         <w:rPr>
-          <w:rFonts w:ascii="Noto Serif SC" w:eastAsia="Noto Serif SC" w:hAnsi="Noto Serif SC"/>
           <w:noProof/>
         </w:rPr>
-        <w:pict w14:anchorId="4865C032">
-          <v:shape id="_x0000_i1025" type="#_x0000_t75" alt="" style="width:10.3pt;height:12.55pt;mso-width-percent:0;mso-height-percent:0;mso-width-percent:0;mso-height-percent:0">
-            <v:imagedata croptop="-65520f" cropbottom="65520f"/>
-          </v:shape>
-        </w:pict>
+        <w:drawing>
+          <wp:anchor distT="0" distB="0" distL="114300" distR="114300" simplePos="0" relativeHeight="251662336" behindDoc="0" locked="0" layoutInCell="1" allowOverlap="1" wp14:anchorId="75E6ED22" wp14:editId="4654356A">
+            <wp:simplePos x="0" y="0"/>
+            <wp:positionH relativeFrom="column">
+              <wp:posOffset>929171</wp:posOffset>
+            </wp:positionH>
+            <wp:positionV relativeFrom="paragraph">
+              <wp:posOffset>22225</wp:posOffset>
+            </wp:positionV>
+            <wp:extent cx="109220" cy="165735"/>
+            <wp:effectExtent l="19050" t="19050" r="24130" b="24765"/>
+            <wp:wrapNone/>
+            <wp:docPr id="1750481344" name="Picture 10" descr="A black background with a black square&#10;&#10;Description automatically generated with medium confidence"/>
+            <wp:cNvGraphicFramePr>
+              <a:graphicFrameLocks xmlns:a="http://schemas.openxmlformats.org/drawingml/2006/main" noChangeAspect="1"/>
+            </wp:cNvGraphicFramePr>
+            <a:graphic xmlns:a="http://schemas.openxmlformats.org/drawingml/2006/main">
+              <a:graphicData uri="http://schemas.openxmlformats.org/drawingml/2006/picture">
+                <pic:pic xmlns:pic="http://schemas.openxmlformats.org/drawingml/2006/picture">
+                  <pic:nvPicPr>
+                    <pic:cNvPr id="1615427624" name="Picture 10" descr="A black background with a black square&#10;&#10;Description automatically generated with medium confidence"/>
+                    <pic:cNvPicPr>
+                      <a:picLocks noChangeAspect="1"/>
+                    </pic:cNvPicPr>
+                  </pic:nvPicPr>
+                  <pic:blipFill>
+                    <a:blip r:embed="rId20" cstate="print">
+                      <a:extLst>
+                        <a:ext uri="{28A0092B-C50C-407E-A947-70E740481C1C}">
+                          <a14:useLocalDpi xmlns:a14="http://schemas.microsoft.com/office/drawing/2010/main" val="0"/>
+                        </a:ext>
+                      </a:extLst>
+                    </a:blip>
+                    <a:srcRect/>
+                    <a:stretch>
+                      <a:fillRect/>
+                    </a:stretch>
+                  </pic:blipFill>
+                  <pic:spPr bwMode="auto">
+                    <a:xfrm rot="21041006">
+                      <a:off x="0" y="0"/>
+                      <a:ext cx="109220" cy="165735"/>
+                    </a:xfrm>
+                    <a:prstGeom prst="rect">
+                      <a:avLst/>
+                    </a:prstGeom>
+                    <a:noFill/>
+                    <a:ln>
+                      <a:noFill/>
+                    </a:ln>
+                  </pic:spPr>
+                </pic:pic>
+              </a:graphicData>
+            </a:graphic>
+          </wp:anchor>
+        </w:drawing>
       </w:r>
       <w:r>
         <w:rPr>
@@ -7575,7 +7888,7 @@
     </w:p>
     <w:p>
       <w:pPr>
-        <w:ind w:left="1440"/>
+        <w:ind w:left="2160"/>
         <w:rPr>
           <w:rFonts w:ascii="Noto Serif SC" w:eastAsia="Noto Serif SC" w:hAnsi="Noto Serif SC" w:cs="Noto Serif"/>
           <w:bCs/>
@@ -7589,7 +7902,7 @@
           <w:szCs w:val="21"/>
         </w:rPr>
         <w:drawing>
-          <wp:anchor distT="0" distB="0" distL="114300" distR="114300" simplePos="0" relativeHeight="251660288" behindDoc="0" locked="0" layoutInCell="1" allowOverlap="1" wp14:anchorId="4530C89D" wp14:editId="43B4E682">
+          <wp:anchor distT="0" distB="0" distL="114300" distR="114300" simplePos="0" relativeHeight="251660288" behindDoc="0" locked="0" layoutInCell="1" allowOverlap="1" wp14:anchorId="4530C89D" wp14:editId="531FF1C6">
             <wp:simplePos x="0" y="0"/>
             <wp:positionH relativeFrom="column">
               <wp:posOffset>958850</wp:posOffset>
@@ -7655,9 +7968,23 @@
         <w:rPr>
           <w:rFonts w:ascii="Noto Serif SC" w:eastAsia="Noto Serif SC" w:hAnsi="Noto Serif SC" w:cs="Noto Serif" w:hint="eastAsia"/>
           <w:bCs/>
+        </w:rPr>
+        <w:t>：</w:t>
+      </w:r>
+      <w:r>
+        <w:rPr>
+          <w:rFonts w:ascii="Noto Serif SC" w:eastAsia="Noto Serif SC" w:hAnsi="Noto Serif SC" w:cs="Noto Serif"/>
+          <w:bCs/>
+        </w:rPr>
+        <w:t>空气音</w:t>
+      </w:r>
+      <w:r>
+        <w:rPr>
+          <w:rFonts w:ascii="Noto Serif SC" w:eastAsia="Noto Serif SC" w:hAnsi="Noto Serif SC" w:cs="Noto Serif" w:hint="eastAsia"/>
+          <w:bCs/>
           <w:lang w:val="en-GB"/>
         </w:rPr>
-        <w:t xml:space="preserve">  </w:t>
+        <w:t>（</w:t>
       </w:r>
       <w:r>
         <w:rPr>
@@ -7665,81 +7992,78 @@
           <w:bCs/>
           <w:lang w:val="en-GB"/>
         </w:rPr>
+        <w:t>air ton</w:t>
+      </w:r>
+      <w:r>
+        <w:rPr>
+          <w:rFonts w:ascii="Noto Serif SC" w:eastAsia="Noto Serif SC" w:hAnsi="Noto Serif SC" w:cs="Noto Serif" w:hint="eastAsia"/>
+          <w:bCs/>
+          <w:lang w:val="en-GB"/>
+        </w:rPr>
+        <w:t>e）</w:t>
+      </w:r>
+      <w:r>
+        <w:rPr>
+          <w:rFonts w:ascii="Noto Serif SC" w:eastAsia="Noto Serif SC" w:hAnsi="Noto Serif SC" w:cs="Noto Serif" w:hint="eastAsia"/>
+          <w:bCs/>
+        </w:rPr>
+        <w:t>在相应的音高位置吹奏气声,即:嘴唇稍稍离开吹孔而使一定的气漏出孔外，兼有吹气声和谱面上所标示的具体音高。</w:t>
+      </w:r>
+      <w:r>
+        <w:rPr>
+          <w:rFonts w:ascii="Noto Serif SC" w:eastAsia="Noto Serif SC" w:hAnsi="Noto Serif SC" w:cs="Noto Serif"/>
+          <w:bCs/>
+        </w:rPr>
+        <w:t xml:space="preserve">Play the air sound at the corresponding pitch, </w:t>
+      </w:r>
+      <w:r>
+        <w:rPr>
+          <w:rFonts w:ascii="Noto Serif SC" w:eastAsia="Noto Serif SC" w:hAnsi="Noto Serif SC" w:cs="Noto Serif" w:hint="eastAsia"/>
+          <w:bCs/>
+        </w:rPr>
+        <w:t>i.e.</w:t>
+      </w:r>
+      <w:r>
+        <w:rPr>
+          <w:rFonts w:ascii="Noto Serif SC" w:eastAsia="Noto Serif SC" w:hAnsi="Noto Serif SC" w:cs="Noto Serif"/>
+          <w:bCs/>
+        </w:rPr>
+        <w:t xml:space="preserve"> the lips are </w:t>
+      </w:r>
+      <w:r>
+        <w:rPr>
+          <w:rFonts w:ascii="Noto Serif SC" w:eastAsia="Noto Serif SC" w:hAnsi="Noto Serif SC" w:cs="Noto Serif" w:hint="eastAsia"/>
+          <w:bCs/>
+        </w:rPr>
+        <w:t xml:space="preserve">positioned </w:t>
+      </w:r>
+      <w:r>
+        <w:rPr>
+          <w:rFonts w:ascii="Noto Serif SC" w:eastAsia="Noto Serif SC" w:hAnsi="Noto Serif SC" w:cs="Noto Serif"/>
+          <w:bCs/>
+        </w:rPr>
+        <w:t>slightly away from the</w:t>
+      </w:r>
+      <w:r>
+        <w:rPr>
+          <w:rFonts w:ascii="Noto Serif SC" w:eastAsia="Noto Serif SC" w:hAnsi="Noto Serif SC" w:cs="Noto Serif"/>
+          <w:bCs/>
+        </w:rPr>
         <w:t xml:space="preserve"> </w:t>
       </w:r>
       <w:r>
         <w:rPr>
           <w:rFonts w:ascii="Noto Serif SC" w:eastAsia="Noto Serif SC" w:hAnsi="Noto Serif SC" w:cs="Noto Serif"/>
           <w:bCs/>
-          <w:lang w:val="en-GB"/>
-        </w:rPr>
-        <w:t xml:space="preserve">         </w:t>
-      </w:r>
-      <w:r>
-        <w:rPr>
-          <w:rFonts w:ascii="Noto Serif SC" w:eastAsia="Noto Serif SC" w:hAnsi="Noto Serif SC" w:cs="Noto Serif" w:hint="eastAsia"/>
-          <w:bCs/>
-        </w:rPr>
-        <w:t>：(air tone) 在相应的音高位置吹奏气声,即:嘴唇稍稍离开吹孔而使一定的气漏出孔外，兼有吹气声和谱面上所标示的具</w:t>
-      </w:r>
-      <w:r>
-        <w:rPr>
-          <w:rFonts w:ascii="Noto Serif SC" w:eastAsia="Noto Serif SC" w:hAnsi="Noto Serif SC" w:cs="Noto Serif"/>
-          <w:bCs/>
-          <w:lang w:val="en-US"/>
-        </w:rPr>
-        <w:tab/>
-      </w:r>
-      <w:r>
-        <w:rPr>
-          <w:rFonts w:ascii="Noto Serif SC" w:eastAsia="Noto Serif SC" w:hAnsi="Noto Serif SC" w:cs="Noto Serif"/>
-          <w:bCs/>
-          <w:lang w:val="en-US"/>
-        </w:rPr>
-        <w:tab/>
-        <w:t xml:space="preserve">    </w:t>
-      </w:r>
-      <w:r>
-        <w:rPr>
-          <w:rFonts w:ascii="Noto Serif SC" w:eastAsia="Noto Serif SC" w:hAnsi="Noto Serif SC" w:cs="Noto Serif" w:hint="eastAsia"/>
-          <w:bCs/>
-        </w:rPr>
-        <w:t>体音高。</w:t>
-      </w:r>
-      <w:r>
-        <w:rPr>
-          <w:rFonts w:ascii="Noto Serif SC" w:eastAsia="Noto Serif SC" w:hAnsi="Noto Serif SC" w:cs="Noto Serif"/>
-          <w:bCs/>
-        </w:rPr>
-        <w:t xml:space="preserve">Play the air sound at the corresponding pitch, </w:t>
-      </w:r>
-      <w:r>
-        <w:rPr>
-          <w:rFonts w:ascii="Noto Serif SC" w:eastAsia="Noto Serif SC" w:hAnsi="Noto Serif SC" w:cs="Noto Serif" w:hint="eastAsia"/>
-          <w:bCs/>
-        </w:rPr>
-        <w:t>i.e.</w:t>
-      </w:r>
-      <w:r>
-        <w:rPr>
-          <w:rFonts w:ascii="Noto Serif SC" w:eastAsia="Noto Serif SC" w:hAnsi="Noto Serif SC" w:cs="Noto Serif"/>
-          <w:bCs/>
-        </w:rPr>
-        <w:t xml:space="preserve"> the lips are </w:t>
-      </w:r>
-      <w:r>
-        <w:rPr>
-          <w:rFonts w:ascii="Noto Serif SC" w:eastAsia="Noto Serif SC" w:hAnsi="Noto Serif SC" w:cs="Noto Serif" w:hint="eastAsia"/>
-          <w:bCs/>
-        </w:rPr>
-        <w:t xml:space="preserve">positioned </w:t>
-      </w:r>
-      <w:r>
-        <w:rPr>
-          <w:rFonts w:ascii="Noto Serif SC" w:eastAsia="Noto Serif SC" w:hAnsi="Noto Serif SC" w:cs="Noto Serif"/>
-          <w:bCs/>
-        </w:rPr>
-        <w:t xml:space="preserve">slightly away from the </w:t>
+        </w:rPr>
+        <w:t>mouthpiece to allow a certain amount of air to leak out of the hole</w:t>
+      </w:r>
+      <w:r>
+        <w:rPr>
+          <w:rFonts w:ascii="Noto Serif SC" w:eastAsia="Noto Serif SC" w:hAnsi="Noto Serif SC" w:cs="Noto Serif" w:hint="eastAsia"/>
+          <w:bCs/>
+        </w:rPr>
+        <w:t>.</w:t>
       </w:r>
       <w:r>
         <w:rPr>
@@ -7750,33 +8074,31 @@
       </w:r>
       <w:r>
         <w:rPr>
-          <w:rFonts w:ascii="Noto Serif SC" w:eastAsia="Noto Serif SC" w:hAnsi="Noto Serif SC" w:cs="Noto Serif"/>
-          <w:bCs/>
-        </w:rPr>
-        <w:tab/>
-        <w:t xml:space="preserve">  </w:t>
-      </w:r>
-      <w:r>
-        <w:rPr>
-          <w:rFonts w:ascii="Noto Serif SC" w:eastAsia="Noto Serif SC" w:hAnsi="Noto Serif SC" w:cs="Noto Serif"/>
-          <w:bCs/>
-        </w:rPr>
-        <w:tab/>
-        <w:t xml:space="preserve">    </w:t>
-      </w:r>
-      <w:r>
-        <w:rPr>
-          <w:rFonts w:ascii="Noto Serif SC" w:eastAsia="Noto Serif SC" w:hAnsi="Noto Serif SC" w:cs="Noto Serif"/>
-          <w:bCs/>
-        </w:rPr>
-        <w:t>mouthpiece to allow a certain amount of air to leak out of the hole</w:t>
-      </w:r>
-      <w:r>
-        <w:rPr>
-          <w:rFonts w:ascii="Noto Serif SC" w:eastAsia="Noto Serif SC" w:hAnsi="Noto Serif SC" w:cs="Noto Serif" w:hint="eastAsia"/>
-          <w:bCs/>
-        </w:rPr>
-        <w:t>.</w:t>
+          <w:rFonts w:ascii="Noto Serif SC" w:eastAsia="Noto Serif SC" w:hAnsi="Noto Serif SC" w:cs="Noto Serif" w:hint="eastAsia"/>
+          <w:bCs/>
+        </w:rPr>
+        <w:t>B</w:t>
+      </w:r>
+      <w:r>
+        <w:rPr>
+          <w:rFonts w:ascii="Noto Serif SC" w:eastAsia="Noto Serif SC" w:hAnsi="Noto Serif SC" w:cs="Noto Serif"/>
+          <w:bCs/>
+        </w:rPr>
+        <w:t xml:space="preserve">oth the </w:t>
+      </w:r>
+      <w:r>
+        <w:rPr>
+          <w:rFonts w:ascii="Noto Serif SC" w:eastAsia="Noto Serif SC" w:hAnsi="Noto Serif SC" w:cs="Noto Serif" w:hint="eastAsia"/>
+          <w:bCs/>
+        </w:rPr>
+        <w:t>air note</w:t>
+      </w:r>
+      <w:r>
+        <w:rPr>
+          <w:rFonts w:ascii="Noto Serif SC" w:eastAsia="Noto Serif SC" w:hAnsi="Noto Serif SC" w:cs="Noto Serif"/>
+          <w:bCs/>
+        </w:rPr>
+        <w:t xml:space="preserve"> and the specific pitch</w:t>
       </w:r>
       <w:r>
         <w:rPr>
@@ -7784,42 +8106,6 @@
           <w:bCs/>
         </w:rPr>
         <w:t xml:space="preserve"> </w:t>
-      </w:r>
-      <w:r>
-        <w:rPr>
-          <w:rFonts w:ascii="Noto Serif SC" w:eastAsia="Noto Serif SC" w:hAnsi="Noto Serif SC" w:cs="Noto Serif" w:hint="eastAsia"/>
-          <w:bCs/>
-        </w:rPr>
-        <w:t>B</w:t>
-      </w:r>
-      <w:r>
-        <w:rPr>
-          <w:rFonts w:ascii="Noto Serif SC" w:eastAsia="Noto Serif SC" w:hAnsi="Noto Serif SC" w:cs="Noto Serif"/>
-          <w:bCs/>
-        </w:rPr>
-        <w:t xml:space="preserve">oth the </w:t>
-      </w:r>
-      <w:r>
-        <w:rPr>
-          <w:rFonts w:ascii="Noto Serif SC" w:eastAsia="Noto Serif SC" w:hAnsi="Noto Serif SC" w:cs="Noto Serif" w:hint="eastAsia"/>
-          <w:bCs/>
-        </w:rPr>
-        <w:t>air note</w:t>
-      </w:r>
-      <w:r>
-        <w:rPr>
-          <w:rFonts w:ascii="Noto Serif SC" w:eastAsia="Noto Serif SC" w:hAnsi="Noto Serif SC" w:cs="Noto Serif"/>
-          <w:bCs/>
-        </w:rPr>
-        <w:t xml:space="preserve"> and the specific pitch </w:t>
-      </w:r>
-      <w:r>
-        <w:rPr>
-          <w:rFonts w:ascii="Noto Serif SC" w:eastAsia="Noto Serif SC" w:hAnsi="Noto Serif SC" w:cs="Noto Serif"/>
-          <w:bCs/>
-        </w:rPr>
-        <w:tab/>
-        <w:t xml:space="preserve">    </w:t>
       </w:r>
       <w:r>
         <w:rPr>
@@ -7977,7 +8263,23 @@
           <w:bCs/>
           <w:lang w:val="en-GB"/>
         </w:rPr>
-        <w:t>the fundamental note (regardless of key signature or proceeding accidental)</w:t>
+        <w:t>the fundamental note (regardless of key signature or pr</w:t>
+      </w:r>
+      <w:r>
+        <w:rPr>
+          <w:rFonts w:ascii="Noto Serif SC" w:eastAsia="Noto Serif SC" w:hAnsi="Noto Serif SC" w:cs="Noto Serif"/>
+          <w:bCs/>
+          <w:lang w:val="en-GB"/>
+        </w:rPr>
+        <w:t>e</w:t>
+      </w:r>
+      <w:r>
+        <w:rPr>
+          <w:rFonts w:ascii="Noto Serif SC" w:eastAsia="Noto Serif SC" w:hAnsi="Noto Serif SC" w:cs="Noto Serif"/>
+          <w:bCs/>
+          <w:lang w:val="en-GB"/>
+        </w:rPr>
+        <w:t>ceding accidental)</w:t>
       </w:r>
       <w:r>
         <w:rPr>
@@ -8358,15 +8660,6 @@
         </w:rPr>
         <w:t>play.</w:t>
       </w:r>
-    </w:p>
-    <w:p>
-      <w:pPr>
-        <w:rPr>
-          <w:rFonts w:ascii="Noto Serif SC" w:eastAsia="Noto Serif SC" w:hAnsi="Noto Serif SC" w:cs="Noto Serif"/>
-          <w:bCs/>
-          <w:lang w:val="en-US"/>
-        </w:rPr>
-      </w:pPr>
     </w:p>
     <w:p>
       <w:pPr>
@@ -8595,7 +8888,7 @@
         <mc:AlternateContent>
           <mc:Choice Requires="wpg">
             <w:drawing>
-              <wp:inline distT="0" distB="0" distL="0" distR="0" wp14:anchorId="4F812E3F" wp14:editId="30594111">
+              <wp:inline distT="0" distB="0" distL="0" distR="0" wp14:anchorId="4F812E3F" wp14:editId="0D13FEBB">
                 <wp:extent cx="422816" cy="135890"/>
                 <wp:effectExtent l="0" t="0" r="0" b="0"/>
                 <wp:docPr id="495536661" name="Group 6"/>
@@ -8835,6 +9128,13 @@
           <w:bCs/>
         </w:rPr>
         <w:t xml:space="preserve">：连续快速弹挑，和震音的意义相同 </w:t>
+      </w:r>
+      <w:r>
+        <w:rPr>
+          <w:rFonts w:ascii="Noto Serif SC" w:eastAsia="Noto Serif SC" w:hAnsi="Noto Serif SC" w:cs="Noto Serif"/>
+          <w:bCs/>
+        </w:rPr>
+        <w:tab/>
       </w:r>
       <w:r>
         <w:rPr>
@@ -9310,7 +9610,21 @@
           <w:rFonts w:ascii="Noto Serif SC" w:eastAsia="Noto Serif SC" w:hAnsi="Noto Serif SC" w:cs="Noto Serif"/>
           <w:bCs/>
         </w:rPr>
-        <w:t xml:space="preserve"> note, and</w:t>
+        <w:t xml:space="preserve"> </w:t>
+      </w:r>
+      <w:r>
+        <w:rPr>
+          <w:rFonts w:ascii="Noto Serif SC" w:eastAsia="Noto Serif SC" w:hAnsi="Noto Serif SC" w:cs="Noto Serif" w:hint="eastAsia"/>
+          <w:bCs/>
+        </w:rPr>
+        <w:t>pitch</w:t>
+      </w:r>
+      <w:r>
+        <w:rPr>
+          <w:rFonts w:ascii="Noto Serif SC" w:eastAsia="Noto Serif SC" w:hAnsi="Noto Serif SC" w:cs="Noto Serif"/>
+          <w:bCs/>
+        </w:rPr>
+        <w:t>, and</w:t>
       </w:r>
       <w:r>
         <w:rPr>
@@ -11122,6 +11436,13 @@
           <w:rFonts w:ascii="Noto Serif SC" w:eastAsia="Noto Serif SC" w:hAnsi="Noto Serif SC" w:cs="Noto Serif" w:hint="eastAsia"/>
           <w:bCs/>
         </w:rPr>
+        <w:t xml:space="preserve">play </w:t>
+      </w:r>
+      <w:r>
+        <w:rPr>
+          <w:rFonts w:ascii="Noto Serif SC" w:eastAsia="Noto Serif SC" w:hAnsi="Noto Serif SC" w:cs="Noto Serif" w:hint="eastAsia"/>
+          <w:bCs/>
+        </w:rPr>
         <w:t>the top voice</w:t>
       </w:r>
       <w:r>
@@ -11266,7 +11587,21 @@
           <w:rFonts w:ascii="Noto Serif SC" w:eastAsia="Noto Serif SC" w:hAnsi="Noto Serif SC" w:cs="Noto Serif"/>
           <w:bCs/>
         </w:rPr>
-        <w:t xml:space="preserve"> person will play the second part.</w:t>
+        <w:t xml:space="preserve"> person will play the second </w:t>
+      </w:r>
+      <w:r>
+        <w:rPr>
+          <w:rFonts w:ascii="Noto Serif SC" w:eastAsia="Noto Serif SC" w:hAnsi="Noto Serif SC" w:cs="Noto Serif" w:hint="eastAsia"/>
+          <w:bCs/>
+        </w:rPr>
+        <w:t>voice</w:t>
+      </w:r>
+      <w:r>
+        <w:rPr>
+          <w:rFonts w:ascii="Noto Serif SC" w:eastAsia="Noto Serif SC" w:hAnsi="Noto Serif SC" w:cs="Noto Serif"/>
+          <w:bCs/>
+        </w:rPr>
+        <w:t>.</w:t>
       </w:r>
       <w:r>
         <w:rPr>
@@ -11404,14 +11739,14 @@
         <v:path o:extrusionok="f" gradientshapeok="t" o:connecttype="rect"/>
         <o:lock v:ext="edit" aspectratio="t"/>
       </v:shapetype>
-      <v:shape id="_x0000_i1060" type="#_x0000_t75" alt="A black background with a black square&#13;&#13;&#13;&#13;&#13;&#13;&#13;&#13;&#13;&#13;&#13;&#10;&#13;&#13;&#13;&#13;&#13;&#13;&#13;&#13;&#13;&#13;&#13;&#10;Description automatically generated with medium confidence" style="width:3in;height:523.45pt;visibility:visible;mso-wrap-style:square" o:bullet="t">
-        <v:imagedata r:id="rId1" o:title="A black background with a black square&#13;&#13;&#13;&#13;&#13;&#13;&#13;&#13;&#13;&#13;&#13;&#10;&#13;&#13;&#13;&#13;&#13;&#13;&#13;&#13;&#13;&#13;&#13;&#10;Description automatically generated with medium confidence"/>
+      <v:shape id="_x0000_i1120" type="#_x0000_t75" alt="A black background with a black square&#10;&#10;&#10;&#10;&#10;&#10;&#10;&#10;&#10;&#10;&#10;&#10;&#10;&#10;&#10;&#10;&#10;&#10;&#10;&#10;&#10;&#10;&#10;&#10;Description automatically generated with medium confidence" style="width:3in;height:523.65pt;visibility:visible;mso-wrap-style:square" o:bullet="t">
+        <v:imagedata r:id="rId1" o:title="A black background with a black square&#10;&#10;&#10;&#10;&#10;&#10;&#10;&#10;&#10;&#10;&#10;&#10;&#10;&#10;&#10;&#10;&#10;&#10;&#10;&#10;&#10;&#10;&#10;&#10;Description automatically generated with medium confidence"/>
       </v:shape>
     </w:pict>
   </w:numPicBullet>
   <w:numPicBullet w:numPicBulletId="1">
     <w:pict>
-      <v:shape id="_x0000_i1061" type="#_x0000_t75" style="width:276.55pt;height:422.85pt;flip:x;visibility:visible;mso-wrap-style:square" o:bullet="t">
+      <v:shape id="_x0000_i1121" type="#_x0000_t75" style="width:276.3pt;height:422.65pt;flip:x;visibility:visible;mso-wrap-style:square" o:bullet="t">
         <v:imagedata r:id="rId2" o:title=""/>
       </v:shape>
     </w:pict>
@@ -13112,7 +13447,6 @@
   <w:style w:type="character" w:default="1" w:styleId="DefaultParagraphFont">
     <w:name w:val="Default Paragraph Font"/>
     <w:uiPriority w:val="1"/>
-    <w:semiHidden/>
     <w:unhideWhenUsed/>
   </w:style>
   <w:style w:type="table" w:default="1" w:styleId="TableNormal">

</xml_diff>

<commit_message>
Score 3: Front matter update clean up
</commit_message>
<xml_diff>
--- a/Front Matter/Template/Pieces/3_Front-Matter.docx
+++ b/Front Matter/Template/Pieces/3_Front-Matter.docx
@@ -5861,7 +5861,7 @@
       <w:pPr>
         <w:ind w:left="1440" w:hanging="1080"/>
         <w:rPr>
-          <w:rFonts w:ascii="Noto Serif SC" w:eastAsia="Noto Serif SC" w:hAnsi="Noto Serif SC" w:cs="Noto Serif" w:hint="eastAsia"/>
+          <w:rFonts w:ascii="Noto Serif SC" w:eastAsia="Noto Serif SC" w:hAnsi="Noto Serif SC" w:cs="Noto Serif"/>
           <w:bCs/>
           <w:lang w:val="en-GB"/>
         </w:rPr>
@@ -5968,11 +5968,11 @@
       </w:r>
       <w:r>
         <w:rPr>
-          <w:rFonts w:ascii="Noto Serif SC" w:eastAsia="Noto Serif SC" w:hAnsi="Noto Serif SC" w:cs="Noto Serif" w:hint="eastAsia"/>
+          <w:rFonts w:ascii="Noto Serif SC" w:eastAsia="Noto Serif SC" w:hAnsi="Noto Serif SC" w:cs="Noto Serif"/>
           <w:bCs/>
           <w:lang w:val="en-GB"/>
         </w:rPr>
-        <w:t>; cancels out any previous technical instructions.</w:t>
+        <w:t>.</w:t>
       </w:r>
     </w:p>
     <w:p>
@@ -6027,7 +6027,7 @@
       <w:pPr>
         <w:ind w:left="360"/>
         <w:rPr>
-          <w:rFonts w:ascii="Noto Serif SC" w:eastAsia="Noto Serif SC" w:hAnsi="Noto Serif SC" w:cs="Noto Serif" w:hint="eastAsia"/>
+          <w:rFonts w:ascii="Noto Serif SC" w:eastAsia="Noto Serif SC" w:hAnsi="Noto Serif SC" w:cs="Noto Serif"/>
           <w:bCs/>
           <w:lang w:val="en-GB"/>
         </w:rPr>
@@ -6130,7 +6130,7 @@
       <w:pPr>
         <w:ind w:left="360"/>
         <w:rPr>
-          <w:rFonts w:ascii="Noto Serif SC" w:eastAsia="Noto Serif SC" w:hAnsi="Noto Serif SC" w:cs="Noto Serif" w:hint="eastAsia"/>
+          <w:rFonts w:ascii="Noto Serif SC" w:eastAsia="Noto Serif SC" w:hAnsi="Noto Serif SC" w:cs="Noto Serif"/>
           <w:bCs/>
         </w:rPr>
       </w:pPr>
@@ -6232,7 +6232,7 @@
       <w:pPr>
         <w:ind w:left="360"/>
         <w:rPr>
-          <w:rFonts w:ascii="Noto Serif SC" w:eastAsia="Noto Serif SC" w:hAnsi="Noto Serif SC" w:cs="Noto Serif" w:hint="eastAsia"/>
+          <w:rFonts w:ascii="Noto Serif SC" w:eastAsia="Noto Serif SC" w:hAnsi="Noto Serif SC" w:cs="Noto Serif"/>
           <w:bCs/>
           <w:lang w:val="en-GB"/>
         </w:rPr>
@@ -7218,7 +7218,7 @@
           <w:noProof/>
         </w:rPr>
         <w:pict w14:anchorId="62D7E167">
-          <v:shape id="Picture 7" o:spid="_x0000_i1027" type="#_x0000_t75" alt="A black background with a black square&#10;&#10;&#10;&#10;&#10;&#10;&#10;&#10;&#10;&#10;&#10;&#10;&#10;&#10;&#10;&#10;&#10;&#10;&#10;&#10;&#10;&#10;&#10;&#10;Description automatically generated with medium confidence" style="width:7.95pt;height:13.55pt;visibility:visible;mso-wrap-style:square;mso-width-percent:0;mso-height-percent:0;mso-width-percent:0;mso-height-percent:0">
+          <v:shape id="Picture 7" o:spid="_x0000_i1027" type="#_x0000_t75" alt="A black background with a black square&#10;&#10;&#10;&#10;&#10;&#10;&#10;&#10;&#10;&#10;&#10;&#10;&#10;&#10;&#10;&#10;&#10;&#10;&#10;&#10;&#10;&#10;&#10;&#10;Description automatically generated with medium confidence" style="width:8.35pt;height:13.4pt;visibility:visible;mso-wrap-style:square;mso-width-percent:0;mso-height-percent:0;mso-width-percent:0;mso-height-percent:0">
             <v:imagedata r:id="rId19" o:title="A black background with a black square&#10;&#10;&#10;&#10;&#10;&#10;&#10;&#10;&#10;&#10;&#10;&#10;&#10;&#10;&#10;&#10;&#10;&#10;&#10;&#10;&#10;&#10;&#10;&#10;Description automatically generated with medium confidence"/>
           </v:shape>
         </w:pict>
@@ -7902,7 +7902,7 @@
           <w:szCs w:val="21"/>
         </w:rPr>
         <w:drawing>
-          <wp:anchor distT="0" distB="0" distL="114300" distR="114300" simplePos="0" relativeHeight="251660288" behindDoc="0" locked="0" layoutInCell="1" allowOverlap="1" wp14:anchorId="4530C89D" wp14:editId="531FF1C6">
+          <wp:anchor distT="0" distB="0" distL="114300" distR="114300" simplePos="0" relativeHeight="251660288" behindDoc="0" locked="0" layoutInCell="1" allowOverlap="1" wp14:anchorId="4530C89D" wp14:editId="0F76E920">
             <wp:simplePos x="0" y="0"/>
             <wp:positionH relativeFrom="column">
               <wp:posOffset>958850</wp:posOffset>
@@ -8394,7 +8394,6 @@
         <w:rPr>
           <w:rFonts w:ascii="Noto Serif SC" w:eastAsia="Noto Serif SC" w:hAnsi="Noto Serif SC" w:cs="Noto Serif"/>
           <w:bCs/>
-          <w:lang w:val="en-US"/>
         </w:rPr>
       </w:pPr>
       <w:r>
@@ -8660,6 +8659,15 @@
         </w:rPr>
         <w:t>play.</w:t>
       </w:r>
+    </w:p>
+    <w:p>
+      <w:pPr>
+        <w:rPr>
+          <w:rFonts w:ascii="Noto Serif SC" w:eastAsia="Noto Serif SC" w:hAnsi="Noto Serif SC" w:cs="Noto Serif"/>
+          <w:bCs/>
+          <w:lang w:val="en-US"/>
+        </w:rPr>
+      </w:pPr>
     </w:p>
     <w:p>
       <w:pPr>
@@ -11603,15 +11611,6 @@
         </w:rPr>
         <w:t>.</w:t>
       </w:r>
-      <w:r>
-        <w:rPr>
-          <w:rFonts w:ascii="Noto Serif SC" w:eastAsia="Noto Serif SC" w:hAnsi="Noto Serif SC" w:cs="Noto Serif"/>
-          <w:bCs/>
-          <w:sz w:val="24"/>
-          <w:szCs w:val="24"/>
-        </w:rPr>
-        <w:br/>
-      </w:r>
     </w:p>
     <w:p>
       <w:pPr>
@@ -11739,14 +11738,14 @@
         <v:path o:extrusionok="f" gradientshapeok="t" o:connecttype="rect"/>
         <o:lock v:ext="edit" aspectratio="t"/>
       </v:shapetype>
-      <v:shape id="_x0000_i1120" type="#_x0000_t75" alt="A black background with a black square&#10;&#10;&#10;&#10;&#10;&#10;&#10;&#10;&#10;&#10;&#10;&#10;&#10;&#10;&#10;&#10;&#10;&#10;&#10;&#10;&#10;&#10;&#10;&#10;Description automatically generated with medium confidence" style="width:3in;height:523.65pt;visibility:visible;mso-wrap-style:square" o:bullet="t">
+      <v:shape id="_x0000_i1034" type="#_x0000_t75" alt="A black background with a black square&#10;&#10;&#10;&#10;&#10;&#10;&#10;&#10;&#10;&#10;&#10;&#10;&#10;&#10;&#10;&#10;&#10;&#10;&#10;&#10;&#10;&#10;&#10;&#10;Description automatically generated with medium confidence" style="width:3in;height:523.25pt;visibility:visible;mso-wrap-style:square" o:bullet="t">
         <v:imagedata r:id="rId1" o:title="A black background with a black square&#10;&#10;&#10;&#10;&#10;&#10;&#10;&#10;&#10;&#10;&#10;&#10;&#10;&#10;&#10;&#10;&#10;&#10;&#10;&#10;&#10;&#10;&#10;&#10;Description automatically generated with medium confidence"/>
       </v:shape>
     </w:pict>
   </w:numPicBullet>
   <w:numPicBullet w:numPicBulletId="1">
     <w:pict>
-      <v:shape id="_x0000_i1121" type="#_x0000_t75" style="width:276.3pt;height:422.65pt;flip:x;visibility:visible;mso-wrap-style:square" o:bullet="t">
+      <v:shape id="_x0000_i1035" type="#_x0000_t75" style="width:276.3pt;height:422.8pt;flip:x;visibility:visible;mso-wrap-style:square" o:bullet="t">
         <v:imagedata r:id="rId2" o:title=""/>
       </v:shape>
     </w:pict>
@@ -13447,6 +13446,7 @@
   <w:style w:type="character" w:default="1" w:styleId="DefaultParagraphFont">
     <w:name w:val="Default Paragraph Font"/>
     <w:uiPriority w:val="1"/>
+    <w:semiHidden/>
     <w:unhideWhenUsed/>
   </w:style>
   <w:style w:type="table" w:default="1" w:styleId="TableNormal">

</xml_diff>